<commit_message>
docs: agregar aprendizajes de testing en sección 8 del documento técnico
Tres lecciones clave del proceso de integración con pytest/asyncpg:
- asyncpg vincula conexiones al Task, no al event loop (solución: dispose)
- Los tests de autorización detectan olvidos de rol (bug admin dashboard)
- El patrón rollback no aplica con drivers async (solución: commit + RUN_ID)

Co-Authored-By: Claude Sonnet 4.6 <noreply@anthropic.com>
</commit_message>
<xml_diff>
--- a/Documentacion_Tecnica_Acompanarte.docx
+++ b/Documentacion_Tecnica_Acompanarte.docx
@@ -14190,6 +14190,168 @@
           <w:szCs w:val="22"/>
         </w:rPr>
         <w:t xml:space="preserve">La limitación de uvicorn --reload con archivos nuevos, y el comportamiento de SQLAlchemy con columnas JSON, son ejemplos de cómo el entorno de desarrollo introduce restricciones que no son obvias en la documentación oficial. Documentarlas evita repetir los mismos diagnósticos.</w:t>
+      </w:r>
+    </w:p>
+    <w:p>
+      <w:pPr>
+        <w:spacing w:after="120"/>
+      </w:pPr>
+      <w:r>
+        <w:t xml:space="preserve"/>
+      </w:r>
+    </w:p>
+    <!-- LECCIÓN: asyncpg Task-binding -->
+    <w:p>
+      <w:pPr>
+        <w:pStyle w:val="Heading2"/>
+        <w:spacing w:after="140" w:before="300"/>
+      </w:pPr>
+      <w:r>
+        <w:rPr>
+          <w:rFonts w:ascii="Arial" w:cs="Arial" w:eastAsia="Arial" w:hAnsi="Arial"/>
+          <w:b/>
+          <w:bCs/>
+          <w:color w:val="1D4E7C"/>
+          <w:sz w:val="26"/>
+          <w:szCs w:val="26"/>
+        </w:rPr>
+        <w:t>Los drivers async vinculan conexiones al Task, no solo al event loop</w:t>
+      </w:r>
+    </w:p>
+    <w:p>
+      <w:pPr>
+        <w:spacing w:after="160"/>
+      </w:pPr>
+      <w:r>
+        <w:rPr>
+          <w:rFonts w:ascii="Arial" w:cs="Arial" w:eastAsia="Arial" w:hAnsi="Arial"/>
+          <w:color w:val="1F2937"/>
+          <w:sz w:val="22"/>
+          <w:szCs w:val="22"/>
+        </w:rPr>
+        <w:t xml:space="preserve">asyncpg (el driver PostgreSQL async de Python) vincula cada conexión al asyncio.Task que la creó, no simplemente al event loop. pytest-asyncio ejecuta fixtures y tests como Tasks separados dentro del mismo loop mediante llamadas sucesivas a run_until_complete. Esto provoca el error “Future attached to a different loop” cuando el pool recicla una conexión del Task del fixture al Task del test, aún cuando comparten el mismo event loop.</w:t>
+      </w:r>
+    </w:p>
+    <w:p>
+      <w:pPr>
+        <w:spacing w:after="160"/>
+      </w:pPr>
+      <w:r>
+        <w:rPr>
+          <w:rFonts w:ascii="Arial" w:cs="Arial" w:eastAsia="Arial" w:hAnsi="Arial"/>
+          <w:color w:val="1F2937"/>
+          <w:sz w:val="22"/>
+          <w:szCs w:val="22"/>
+        </w:rPr>
+        <w:t xml:space="preserve">La solución no requiere NullPool ni reescribir la arquitectura de sesiones: alcanza con llamar engine.sync_engine.dispose(close=False) en un fixture síncrono antes de cada test. Esta operación reemplaza el pool por uno vacío nuevo sin ningún I/O async, de modo que el primer acceso a la BD del test crea su propia conexión en su propio Task. El mismo dispose() aplicado al inicio del teardown resuelve el problema en la limpieza del seed.</w:t>
+      </w:r>
+    </w:p>
+    <w:p>
+      <w:pPr>
+        <w:spacing w:after="120"/>
+      </w:pPr>
+      <w:r>
+        <w:t xml:space="preserve"/>
+      </w:r>
+    </w:p>
+    <!-- LECCIÓN: los tests revelan bugs de seguridad -->
+    <w:p>
+      <w:pPr>
+        <w:pStyle w:val="Heading2"/>
+        <w:spacing w:after="140" w:before="300"/>
+      </w:pPr>
+      <w:r>
+        <w:rPr>
+          <w:rFonts w:ascii="Arial" w:cs="Arial" w:eastAsia="Arial" w:hAnsi="Arial"/>
+          <w:b/>
+          <w:bCs/>
+          <w:color w:val="1D4E7C"/>
+          <w:sz w:val="26"/>
+          <w:szCs w:val="26"/>
+        </w:rPr>
+        <w:t>Los tests de autorización son la única red de seguridad confiable contra olvidos de rol</w:t>
+      </w:r>
+    </w:p>
+    <w:p>
+      <w:pPr>
+        <w:spacing w:after="160"/>
+      </w:pPr>
+      <w:r>
+        <w:rPr>
+          <w:rFonts w:ascii="Arial" w:cs="Arial" w:eastAsia="Arial" w:hAnsi="Arial"/>
+          <w:color w:val="1F2937"/>
+          <w:sz w:val="22"/>
+          <w:szCs w:val="22"/>
+        </w:rPr>
+        <w:t xml:space="preserve">Al escribir test_rol_familia_bloqueado se descubrió que el endpoint GET /api/v1/admin/dashboard no tenía el guard require_roles(“admin”): cualquier usuario autenticado —incluyendo el rol familia— podía acceder a estadísticas globales de usuarios, pacientes y recursos pendientes. El bug no era visible mediante revisión manual del código porque el endpoint sí requireía autenticación (token válido); el test de rol fue el que expuso la brecha.</w:t>
+      </w:r>
+    </w:p>
+    <w:p>
+      <w:pPr>
+        <w:spacing w:after="160"/>
+      </w:pPr>
+      <w:r>
+        <w:rPr>
+          <w:rFonts w:ascii="Arial" w:cs="Arial" w:eastAsia="Arial" w:hAnsi="Arial"/>
+          <w:color w:val="1F2937"/>
+          <w:sz w:val="22"/>
+          <w:szCs w:val="22"/>
+        </w:rPr>
+        <w:t xml:space="preserve">En sistemas con múltiples roles, verificar “requiere autenticación” no es suficiente. Cada endpoint sensible debe tener un test explícito que intente acceder con el rol incorrecto y espere 403. Sin ese test, los olvidos de guard de rol pasan inadvertidos indefinidamente.</w:t>
+      </w:r>
+    </w:p>
+    <w:p>
+      <w:pPr>
+        <w:spacing w:after="120"/>
+      </w:pPr>
+      <w:r>
+        <w:t xml:space="preserve"/>
+      </w:r>
+    </w:p>
+    <!-- LECCIÓN: aislamiento de datos en tests async -->
+    <w:p>
+      <w:pPr>
+        <w:pStyle w:val="Heading2"/>
+        <w:spacing w:after="140" w:before="300"/>
+      </w:pPr>
+      <w:r>
+        <w:rPr>
+          <w:rFonts w:ascii="Arial" w:cs="Arial" w:eastAsia="Arial" w:hAnsi="Arial"/>
+          <w:b/>
+          <w:bCs/>
+          <w:color w:val="1D4E7C"/>
+          <w:sz w:val="26"/>
+          <w:szCs w:val="26"/>
+        </w:rPr>
+        <w:t>El patrón rollback de tests no siempre es aplicable</w:t>
+      </w:r>
+    </w:p>
+    <w:p>
+      <w:pPr>
+        <w:spacing w:after="160"/>
+      </w:pPr>
+      <w:r>
+        <w:rPr>
+          <w:rFonts w:ascii="Arial" w:cs="Arial" w:eastAsia="Arial" w:hAnsi="Arial"/>
+          <w:color w:val="1F2937"/>
+          <w:sz w:val="22"/>
+          <w:szCs w:val="22"/>
+        </w:rPr>
+        <w:t xml:space="preserve">La práctica estándar de aislamiento de tests en bases de datos relacionales —abrir una transacción al inicio del test y hacer rollback al final— requiere compartir una conexión entre el fixture y el test. Eso es imposible con asyncpg por la restricción de Task-binding descripta arriba.</w:t>
+      </w:r>
+    </w:p>
+    <w:p>
+      <w:pPr>
+        <w:spacing w:after="160"/>
+      </w:pPr>
+      <w:r>
+        <w:rPr>
+          <w:rFonts w:ascii="Arial" w:cs="Arial" w:eastAsia="Arial" w:hAnsi="Arial"/>
+          <w:color w:val="1F2937"/>
+          <w:sz w:val="22"/>
+          <w:szCs w:val="22"/>
+        </w:rPr>
+        <w:t xml:space="preserve">La alternativa adoptada es commit + cleanup explícito: el fixture seed inserta los datos de test con COMMIT real (usando un RUN_ID único por corrida para identificarlos), los tests corren normalmente contra esos datos, y al finalizar el módulo el fixture los elimina con DELETE. El trade-off es que los datos persisten en la BD durante la corrida y requieren limpieza manual si pytest se interrumpe; a cambio, no hay ninguna restricción sobre la conexión o el Task que ejecuta cada test.</w:t>
       </w:r>
     </w:p>
     <w:p>

</xml_diff>

<commit_message>
docs: actualizar sección 7 Testing con suite de autenticación (36/36)
- Sección 7 intro y título 7.4: 20/20 → 36/36
- Subsección CU-PUB-01/02/05/06: 16 casos de test_auth.py documentados
- Sección 7.7: añadidos test_auth.py (16 casos) y backend/Dockerfile

Co-Authored-By: Claude Sonnet 4.6 <noreply@anthropic.com>
</commit_message>
<xml_diff>
--- a/Documentacion_Tecnica_Acompanarte.docx
+++ b/Documentacion_Tecnica_Acompanarte.docx
@@ -13059,7 +13059,7 @@
           <w:sz w:val="24"/>
           <w:szCs w:val="24"/>
         </w:rPr>
-        <w:t xml:space="preserve">Se implementó una estrategia de testing en dos capas: tests de integración con pytest sobre el backend FastAPI, y tests E2E con Playwright sobre la interfaz. La suite de integración quedó en verde completo (20/20) y la infraestructura Playwright está scaffoldeada y lista para ejecutarse contra el frontend.</w:t>
+        <w:t xml:space="preserve">Se implementó una estrategia de testing en dos capas: tests de integración con pytest sobre el backend FastAPI, y tests E2E con Playwright sobre la interfaz. La suite de integración quedó en verde completo (36/36) y la infraestructura Playwright está scaffoldeada y lista para ejecutarse contra el frontend.</w:t>
       </w:r>
     </w:p>
     <w:p>
@@ -13345,7 +13345,7 @@
           <w:sz w:val="28"/>
           <w:szCs w:val="28"/>
         </w:rPr>
-        <w:t>7.4 Casos de Test de Integración (20/20 ✅)</w:t>
+        <w:t>7.4 Casos de Test de Integración (36/36 ✅)</w:t>
       </w:r>
     </w:p>
     <w:p>
@@ -13658,6 +13658,246 @@
           <w:szCs w:val="24"/>
         </w:rPr>
         <w:t xml:space="preserve">•  test_desactivar_actividad: PATCH /api/v1/actividades/{id}/desactivar → activa=false en el response.</w:t>
+      </w:r>
+    </w:p>
+    <w:p>
+      <w:pPr>
+        <w:pStyle w:val="Heading3"/>
+        <w:spacing w:after="120" w:before="200"/>
+      </w:pPr>
+      <w:r>
+        <w:rPr>
+          <w:rFonts w:ascii="Arial" w:cs="Arial" w:eastAsia="Arial" w:hAnsi="Arial"/>
+          <w:b/>
+          <w:color w:val="0D6B6E"/>
+          <w:sz w:val="26"/>
+          <w:szCs w:val="26"/>
+        </w:rPr>
+        <w:t>CU-PUB-01 / CU-PUB-02 / CU-PUB-05 / CU-PUB-06 — Autenticación y Control de Acceso</w:t>
+      </w:r>
+    </w:p>
+    <w:p>
+      <w:pPr>
+        <w:spacing w:after="60"/>
+      </w:pPr>
+      <w:r>
+        <w:rPr>
+          <w:rFonts w:ascii="Arial" w:cs="Arial" w:hAnsi="Arial"/>
+          <w:color w:val="1F2937"/>
+          <w:sz w:val="24"/>
+          <w:szCs w:val="24"/>
+        </w:rPr>
+        <w:t xml:space="preserve">•  test_login_admin_retorna_token: POST /api/v1/auth/login con credenciales válidas → 200, access_token presente.</w:t>
+      </w:r>
+    </w:p>
+    <w:p>
+      <w:pPr>
+        <w:spacing w:after="60"/>
+      </w:pPr>
+      <w:r>
+        <w:rPr>
+          <w:rFonts w:ascii="Arial" w:cs="Arial" w:hAnsi="Arial"/>
+          <w:color w:val="1F2937"/>
+          <w:sz w:val="24"/>
+          <w:szCs w:val="24"/>
+        </w:rPr>
+        <w:t xml:space="preserve">•  test_login_admin_default_path_correcto: el campo default_path del admin apunta a /admin.</w:t>
+      </w:r>
+    </w:p>
+    <w:p>
+      <w:pPr>
+        <w:spacing w:after="60"/>
+      </w:pPr>
+      <w:r>
+        <w:rPr>
+          <w:rFonts w:ascii="Arial" w:cs="Arial" w:hAnsi="Arial"/>
+          <w:color w:val="1F2937"/>
+          <w:sz w:val="24"/>
+          <w:szCs w:val="24"/>
+        </w:rPr>
+        <w:t xml:space="preserve">•  test_login_terapeuta_interno_retorna_token: login ter-int → 200, rol_key == “ter-int”.</w:t>
+      </w:r>
+    </w:p>
+    <w:p>
+      <w:pPr>
+        <w:spacing w:after="60"/>
+      </w:pPr>
+      <w:r>
+        <w:rPr>
+          <w:rFonts w:ascii="Arial" w:cs="Arial" w:hAnsi="Arial"/>
+          <w:color w:val="1F2937"/>
+          <w:sz w:val="24"/>
+          <w:szCs w:val="24"/>
+        </w:rPr>
+        <w:t xml:space="preserve">•  test_login_familiar_retorna_token: login familiar → 200, rol_key == “familia”.</w:t>
+      </w:r>
+    </w:p>
+    <w:p>
+      <w:pPr>
+        <w:spacing w:after="60"/>
+      </w:pPr>
+      <w:r>
+        <w:rPr>
+          <w:rFonts w:ascii="Arial" w:cs="Arial" w:hAnsi="Arial"/>
+          <w:color w:val="1F2937"/>
+          <w:sz w:val="24"/>
+          <w:szCs w:val="24"/>
+        </w:rPr>
+        <w:t xml:space="preserve">•  test_login_response_tiene_campos_requeridos: id, email, nombre, rol_key, default_path, nav_config presentes.</w:t>
+      </w:r>
+    </w:p>
+    <w:p>
+      <w:pPr>
+        <w:spacing w:after="60"/>
+      </w:pPr>
+      <w:r>
+        <w:rPr>
+          <w:rFonts w:ascii="Arial" w:cs="Arial" w:hAnsi="Arial"/>
+          <w:color w:val="1F2937"/>
+          <w:sz w:val="24"/>
+          <w:szCs w:val="24"/>
+        </w:rPr>
+        <w:t xml:space="preserve">•  test_email_inexistente_retorna_401: email que no existe → 401, sin token.</w:t>
+      </w:r>
+    </w:p>
+    <w:p>
+      <w:pPr>
+        <w:spacing w:after="60"/>
+      </w:pPr>
+      <w:r>
+        <w:rPr>
+          <w:rFonts w:ascii="Arial" w:cs="Arial" w:hAnsi="Arial"/>
+          <w:color w:val="1F2937"/>
+          <w:sz w:val="24"/>
+          <w:szCs w:val="24"/>
+        </w:rPr>
+        <w:t xml:space="preserve">•  test_contrasena_incorrecta_retorna_401: email correcto + contraseña incorrecta → 401.</w:t>
+      </w:r>
+    </w:p>
+    <w:p>
+      <w:pPr>
+        <w:spacing w:after="60"/>
+      </w:pPr>
+      <w:r>
+        <w:rPr>
+          <w:rFonts w:ascii="Arial" w:cs="Arial" w:hAnsi="Arial"/>
+          <w:color w:val="1F2937"/>
+          <w:sz w:val="24"/>
+          <w:szCs w:val="24"/>
+        </w:rPr>
+        <w:t xml:space="preserve">•  test_contrasena_incorrecta_no_retorna_token: respuesta de error no incluye access_token.</w:t>
+      </w:r>
+    </w:p>
+    <w:p>
+      <w:pPr>
+        <w:spacing w:after="60"/>
+      </w:pPr>
+      <w:r>
+        <w:rPr>
+          <w:rFonts w:ascii="Arial" w:cs="Arial" w:hAnsi="Arial"/>
+          <w:color w:val="1F2937"/>
+          <w:sz w:val="24"/>
+          <w:szCs w:val="24"/>
+        </w:rPr>
+        <w:t xml:space="preserve">•  test_sin_datos_retorna_422: body vacío → 422 Unprocessable Entity (validación FastAPI).</w:t>
+      </w:r>
+    </w:p>
+    <w:p>
+      <w:pPr>
+        <w:spacing w:after="60"/>
+      </w:pPr>
+      <w:r>
+        <w:rPr>
+          <w:rFonts w:ascii="Arial" w:cs="Arial" w:hAnsi="Arial"/>
+          <w:color w:val="1F2937"/>
+          <w:sz w:val="24"/>
+          <w:szCs w:val="24"/>
+        </w:rPr>
+        <w:t xml:space="preserve">•  test_me_sin_token_retorna_401: GET /api/v1/auth/me sin Authorization → 401.</w:t>
+      </w:r>
+    </w:p>
+    <w:p>
+      <w:pPr>
+        <w:spacing w:after="60"/>
+      </w:pPr>
+      <w:r>
+        <w:rPr>
+          <w:rFonts w:ascii="Arial" w:cs="Arial" w:hAnsi="Arial"/>
+          <w:color w:val="1F2937"/>
+          <w:sz w:val="24"/>
+          <w:szCs w:val="24"/>
+        </w:rPr>
+        <w:t xml:space="preserve">•  test_me_con_token_invalido_retorna_401: token malformado → 401.</w:t>
+      </w:r>
+    </w:p>
+    <w:p>
+      <w:pPr>
+        <w:spacing w:after="60"/>
+      </w:pPr>
+      <w:r>
+        <w:rPr>
+          <w:rFonts w:ascii="Arial" w:cs="Arial" w:hAnsi="Arial"/>
+          <w:color w:val="1F2937"/>
+          <w:sz w:val="24"/>
+          <w:szCs w:val="24"/>
+        </w:rPr>
+        <w:t xml:space="preserve">•  test_me_con_token_valido_retorna_datos: GET /me con token → 200, email y rol correctos.</w:t>
+      </w:r>
+    </w:p>
+    <w:p>
+      <w:pPr>
+        <w:spacing w:after="60"/>
+      </w:pPr>
+      <w:r>
+        <w:rPr>
+          <w:rFonts w:ascii="Arial" w:cs="Arial" w:hAnsi="Arial"/>
+          <w:color w:val="1F2937"/>
+          <w:sz w:val="24"/>
+          <w:szCs w:val="24"/>
+        </w:rPr>
+        <w:t xml:space="preserve">•  test_me_terapeuta_retorna_rol_correcto: token ter-ext → /me devuelve rol == “ter-ext”.</w:t>
+      </w:r>
+    </w:p>
+    <w:p>
+      <w:pPr>
+        <w:spacing w:after="60"/>
+      </w:pPr>
+      <w:r>
+        <w:rPr>
+          <w:rFonts w:ascii="Arial" w:cs="Arial" w:hAnsi="Arial"/>
+          <w:color w:val="1F2937"/>
+          <w:sz w:val="24"/>
+          <w:szCs w:val="24"/>
+        </w:rPr>
+        <w:t xml:space="preserve">•  test_familiar_no_accede_a_admin_dashboard: token familiar → GET /admin/dashboard → 403.</w:t>
+      </w:r>
+    </w:p>
+    <w:p>
+      <w:pPr>
+        <w:spacing w:after="60"/>
+      </w:pPr>
+      <w:r>
+        <w:rPr>
+          <w:rFonts w:ascii="Arial" w:cs="Arial" w:hAnsi="Arial"/>
+          <w:color w:val="1F2937"/>
+          <w:sz w:val="24"/>
+          <w:szCs w:val="24"/>
+        </w:rPr>
+        <w:t xml:space="preserve">•  test_familiar_no_puede_listar_actividades: token familiar → GET /actividades/ → 403.</w:t>
+      </w:r>
+    </w:p>
+    <w:p>
+      <w:pPr>
+        <w:spacing w:after="160"/>
+      </w:pPr>
+      <w:r>
+        <w:rPr>
+          <w:rFonts w:ascii="Arial" w:cs="Arial" w:hAnsi="Arial"/>
+          <w:color w:val="1F2937"/>
+          <w:sz w:val="24"/>
+          <w:szCs w:val="24"/>
+        </w:rPr>
+        <w:t xml:space="preserve">•  test_terapeuta_externo_no_accede_a_admin_dashboard: token ter-ext → GET /admin/dashboard → 403.</w:t>
       </w:r>
     </w:p>
     <w:p>
@@ -13864,6 +14104,54 @@
           <w:szCs w:val="24"/>
         </w:rPr>
         <w:t xml:space="preserve">  —  10 casos CU-TI-03/04.</w:t>
+      </w:r>
+    </w:p>
+    <w:p>
+      <w:pPr>
+        <w:spacing w:after="60"/>
+      </w:pPr>
+      <w:r>
+        <w:rPr>
+          <w:rFonts w:ascii="Courier New" w:cs="Courier New" w:hAnsi="Courier New"/>
+          <w:color w:val="374151"/>
+          <w:sz w:val="20"/>
+          <w:szCs w:val="20"/>
+          <w:shd w:val="clear" w:color="auto" w:fill="F3F4F6"/>
+        </w:rPr>
+        <w:t xml:space="preserve">tests/integration/test_auth.py</w:t>
+      </w:r>
+      <w:r>
+        <w:rPr>
+          <w:rFonts w:ascii="Arial" w:cs="Arial" w:hAnsi="Arial"/>
+          <w:color w:val="1F2937"/>
+          <w:sz w:val="24"/>
+          <w:szCs w:val="24"/>
+        </w:rPr>
+        <w:t xml:space="preserve">  —  16 casos CU-PUB-01/02/05/06 (autenticación e identidad).</w:t>
+      </w:r>
+    </w:p>
+    <w:p>
+      <w:pPr>
+        <w:spacing w:after="60"/>
+      </w:pPr>
+      <w:r>
+        <w:rPr>
+          <w:rFonts w:ascii="Courier New" w:cs="Courier New" w:hAnsi="Courier New"/>
+          <w:color w:val="374151"/>
+          <w:sz w:val="20"/>
+          <w:szCs w:val="20"/>
+          <w:shd w:val="clear" w:color="auto" w:fill="F3F4F6"/>
+        </w:rPr>
+        <w:t xml:space="preserve">backend/Dockerfile</w:t>
+      </w:r>
+      <w:r>
+        <w:rPr>
+          <w:rFonts w:ascii="Arial" w:cs="Arial" w:hAnsi="Arial"/>
+          <w:color w:val="1F2937"/>
+          <w:sz w:val="24"/>
+          <w:szCs w:val="24"/>
+        </w:rPr>
+        <w:t xml:space="preserve">  —  requirements-test.txt incluido en la imagen para ejecución directa con python -m pytest.</w:t>
       </w:r>
     </w:p>
     <w:p>

</xml_diff>

<commit_message>
docs: actualizar documentación técnica a v1.1 (Mayo 2026)
Agrega Sección 9 con todas las mejoras y nuevas funcionalidades
implementadas desde la última actualización: correcciones al
pipeline Ollama/RAG, configuración de producción DonWeb, 8
correcciones de UX, módulo Pacientes (ter-int), estandarización
de toasts y vista "Mis parientes" para el rol familiar.
Actualiza versión del pie de página a v1.1 · Mayo 2026.

Co-Authored-By: Claude Sonnet 4.6 <noreply@anthropic.com>
</commit_message>
<xml_diff>
--- a/Documentacion_Tecnica_Acompanarte.docx
+++ b/Documentacion_Tecnica_Acompanarte.docx
@@ -14488,7 +14488,6 @@
         <w:t xml:space="preserve"/>
       </w:r>
     </w:p>
-    <!-- LECCIÓN: asyncpg Task-binding -->
     <w:p>
       <w:pPr>
         <w:pStyle w:val="Heading2"/>
@@ -14542,7 +14541,6 @@
         <w:t xml:space="preserve"/>
       </w:r>
     </w:p>
-    <!-- LECCIÓN: los tests revelan bugs de seguridad -->
     <w:p>
       <w:pPr>
         <w:pStyle w:val="Heading2"/>
@@ -14596,7 +14594,6 @@
         <w:t xml:space="preserve"/>
       </w:r>
     </w:p>
-    <!-- LECCIÓN: aislamiento de datos en tests async -->
     <w:p>
       <w:pPr>
         <w:pStyle w:val="Heading2"/>
@@ -14660,6 +14657,533 @@
     </w:p>
     <w:p>
       <w:pPr>
+        <w:spacing w:after="200" w:before="600"/>
+      </w:pPr>
+      <w:r>
+        <w:rPr>
+          <w:rFonts w:ascii="Arial" w:cs="Arial" w:eastAsia="Arial" w:hAnsi="Arial"/>
+          <w:b/>
+          <w:bCs/>
+          <w:color w:val="0D6B6E"/>
+          <w:sz w:val="32"/>
+          <w:szCs w:val="32"/>
+        </w:rPr>
+        <w:t>9. Mejoras y nuevas funcionalidades (Mayo 2026)</w:t>
+      </w:r>
+    </w:p>
+    <w:p>
+      <w:pPr>
+        <w:spacing w:after="160" w:before="240"/>
+      </w:pPr>
+      <w:r>
+        <w:rPr>
+          <w:rFonts w:ascii="Arial" w:cs="Arial" w:eastAsia="Arial" w:hAnsi="Arial"/>
+          <w:b/>
+          <w:bCs/>
+          <w:color w:val="0D6B6E"/>
+          <w:sz w:val="26"/>
+          <w:szCs w:val="26"/>
+        </w:rPr>
+        <w:t>9.1 Correcciones al pipeline Ollama y ajuste del umbral RAG</w:t>
+      </w:r>
+    </w:p>
+    <w:p>
+      <w:pPr>
+        <w:spacing w:after="160"/>
+      </w:pPr>
+      <w:r>
+        <w:rPr>
+          <w:rFonts w:ascii="Arial" w:cs="Arial" w:eastAsia="Arial" w:hAnsi="Arial"/>
+          <w:color w:val="1F2937"/>
+          <w:sz w:val="24"/>
+          <w:szCs w:val="24"/>
+        </w:rPr>
+        <w:t xml:space="preserve">Se identificó que el asistente IA no respondía correctamente cuando el umbral de similitud RAG era demasiado restrictivo. Se diagnosticó el problema mediante logs de httpx y se ajustó el umbral de búsqueda semántica. Adicionalmente, se detectó que curl no está disponible dentro del contenedor Docker, por lo que todas las pruebas de conectividad con Ollama deben realizarse mediante httpx o Python directamente. Se verificó que la variable host.docker.internal funciona correctamente para acceder a Ollama desde el contenedor.</w:t>
+      </w:r>
+    </w:p>
+    <w:p>
+      <w:pPr>
+        <w:spacing w:after="160" w:before="240"/>
+      </w:pPr>
+      <w:r>
+        <w:rPr>
+          <w:rFonts w:ascii="Arial" w:cs="Arial" w:eastAsia="Arial" w:hAnsi="Arial"/>
+          <w:b/>
+          <w:bCs/>
+          <w:color w:val="0D6B6E"/>
+          <w:sz w:val="26"/>
+          <w:szCs w:val="26"/>
+        </w:rPr>
+        <w:t>9.2 Configuración de producción y despliegue en DonWeb</w:t>
+      </w:r>
+    </w:p>
+    <w:p>
+      <w:pPr>
+        <w:spacing w:after="160"/>
+      </w:pPr>
+      <w:r>
+        <w:rPr>
+          <w:rFonts w:ascii="Arial" w:cs="Arial" w:eastAsia="Arial" w:hAnsi="Arial"/>
+          <w:color w:val="1F2937"/>
+          <w:sz w:val="24"/>
+          <w:szCs w:val="24"/>
+        </w:rPr>
+        <w:t xml:space="preserve">Se elaboró la configuración completa de producción para el servidor DonWeb (Ubuntu 22.04 VPS). Incluye: archivo docker-compose.prod.yml con variables de entorno de producción, nginx.conf como reverse proxy en puerto 80/443, archivo .env.prod con todos los secretos, y guía de despliegue paso a paso (DEPLOY.md). La arquitectura de producción mantiene Ollama en el host y expone el frontend compilado en puerto 80 a través de Nginx.</w:t>
+      </w:r>
+    </w:p>
+    <w:p>
+      <w:pPr>
+        <w:spacing w:after="160" w:before="240"/>
+      </w:pPr>
+      <w:r>
+        <w:rPr>
+          <w:rFonts w:ascii="Arial" w:cs="Arial" w:eastAsia="Arial" w:hAnsi="Arial"/>
+          <w:b/>
+          <w:bCs/>
+          <w:color w:val="0D6B6E"/>
+          <w:sz w:val="26"/>
+          <w:szCs w:val="26"/>
+        </w:rPr>
+        <w:t>9.3 Correcciones de UX y bugs detectados en uso</w:t>
+      </w:r>
+    </w:p>
+    <w:p>
+      <w:pPr>
+        <w:spacing w:after="120"/>
+      </w:pPr>
+      <w:r>
+        <w:rPr>
+          <w:rFonts w:ascii="Arial" w:cs="Arial" w:eastAsia="Arial" w:hAnsi="Arial"/>
+          <w:color w:val="1F2937"/>
+          <w:sz w:val="24"/>
+          <w:szCs w:val="24"/>
+        </w:rPr>
+        <w:t xml:space="preserve">Se corrigieron los siguientes problemas detectados durante el uso de la aplicación en modo de desarrollo:</w:t>
+      </w:r>
+    </w:p>
+    <w:p>
+      <w:pPr>
+        <w:spacing w:after="80"/>
+        <w:ind w:left="360"/>
+      </w:pPr>
+      <w:r>
+        <w:rPr>
+          <w:rFonts w:ascii="Arial" w:cs="Arial" w:eastAsia="Arial" w:hAnsi="Arial"/>
+          <w:color w:val="1F2937"/>
+          <w:sz w:val="24"/>
+          <w:szCs w:val="24"/>
+        </w:rPr>
+        <w:t xml:space="preserve">• Toggle ver/ocultar contraseña en las pantallas de inicio de sesión.</w:t>
+      </w:r>
+    </w:p>
+    <w:p>
+      <w:pPr>
+        <w:spacing w:after="80"/>
+        <w:ind w:left="360"/>
+      </w:pPr>
+      <w:r>
+        <w:rPr>
+          <w:rFonts w:ascii="Arial" w:cs="Arial" w:eastAsia="Arial" w:hAnsi="Arial"/>
+          <w:color w:val="1F2937"/>
+          <w:sz w:val="24"/>
+          <w:szCs w:val="24"/>
+        </w:rPr>
+        <w:t xml:space="preserve">• Botón “Consultar Asistente TEA” destacado visualmente en la página de login.</w:t>
+      </w:r>
+    </w:p>
+    <w:p>
+      <w:pPr>
+        <w:spacing w:after="80"/>
+        <w:ind w:left="360"/>
+      </w:pPr>
+      <w:r>
+        <w:rPr>
+          <w:rFonts w:ascii="Arial" w:cs="Arial" w:eastAsia="Arial" w:hAnsi="Arial"/>
+          <w:color w:val="1F2937"/>
+          <w:sz w:val="24"/>
+          <w:szCs w:val="24"/>
+        </w:rPr>
+        <w:t xml:space="preserve">• Etiqueta de navegación “Terapeutas” renombrada a “Usuarios” en el panel de administración.</w:t>
+      </w:r>
+    </w:p>
+    <w:p>
+      <w:pPr>
+        <w:spacing w:after="80"/>
+        <w:ind w:left="360"/>
+      </w:pPr>
+      <w:r>
+        <w:rPr>
+          <w:rFonts w:ascii="Arial" w:cs="Arial" w:eastAsia="Arial" w:hAnsi="Arial"/>
+          <w:color w:val="1F2937"/>
+          <w:sz w:val="24"/>
+          <w:szCs w:val="24"/>
+        </w:rPr>
+        <w:t xml:space="preserve">• Eliminación del doble mensaje en el asistente público cuando se detectaba una alerta.</w:t>
+      </w:r>
+    </w:p>
+    <w:p>
+      <w:pPr>
+        <w:spacing w:after="80"/>
+        <w:ind w:left="360"/>
+      </w:pPr>
+      <w:r>
+        <w:rPr>
+          <w:rFonts w:ascii="Arial" w:cs="Arial" w:eastAsia="Arial" w:hAnsi="Arial"/>
+          <w:color w:val="1F2937"/>
+          <w:sz w:val="24"/>
+          <w:szCs w:val="24"/>
+        </w:rPr>
+        <w:t xml:space="preserve">• Terapeuta recién creado ahora aparece correctamente en la lista de Contactos TEA.</w:t>
+      </w:r>
+    </w:p>
+    <w:p>
+      <w:pPr>
+        <w:spacing w:after="80"/>
+        <w:ind w:left="360"/>
+      </w:pPr>
+      <w:r>
+        <w:rPr>
+          <w:rFonts w:ascii="Arial" w:cs="Arial" w:eastAsia="Arial" w:hAnsi="Arial"/>
+          <w:color w:val="1F2937"/>
+          <w:sz w:val="24"/>
+          <w:szCs w:val="24"/>
+        </w:rPr>
+        <w:t xml:space="preserve">• Correción de permisos: el administrador no podía inactivar usuarios (bug en comparación de rol ORM vs string).</w:t>
+      </w:r>
+    </w:p>
+    <w:p>
+      <w:pPr>
+        <w:spacing w:after="80"/>
+        <w:ind w:left="360"/>
+      </w:pPr>
+      <w:r>
+        <w:rPr>
+          <w:rFonts w:ascii="Arial" w:cs="Arial" w:eastAsia="Arial" w:hAnsi="Arial"/>
+          <w:color w:val="1F2937"/>
+          <w:sz w:val="24"/>
+          <w:szCs w:val="24"/>
+        </w:rPr>
+        <w:t xml:space="preserve">• Eliminación del botón “+ Nuevo Registro” del dashboard del terapeuta interno (redundante).</w:t>
+      </w:r>
+    </w:p>
+    <w:p>
+      <w:pPr>
+        <w:spacing w:after="160"/>
+        <w:ind w:left="360"/>
+      </w:pPr>
+      <w:r>
+        <w:rPr>
+          <w:rFonts w:ascii="Arial" w:cs="Arial" w:eastAsia="Arial" w:hAnsi="Arial"/>
+          <w:color w:val="1F2937"/>
+          <w:sz w:val="24"/>
+          <w:szCs w:val="24"/>
+        </w:rPr>
+        <w:t xml:space="preserve">• Corrección del flujo de registro de pacientes y asociación con familiares.</w:t>
+      </w:r>
+    </w:p>
+    <w:p>
+      <w:pPr>
+        <w:spacing w:after="160" w:before="240"/>
+      </w:pPr>
+      <w:r>
+        <w:rPr>
+          <w:rFonts w:ascii="Arial" w:cs="Arial" w:eastAsia="Arial" w:hAnsi="Arial"/>
+          <w:b/>
+          <w:bCs/>
+          <w:color w:val="0D6B6E"/>
+          <w:sz w:val="26"/>
+          <w:szCs w:val="26"/>
+        </w:rPr>
+        <w:t>9.4 Módulo Pacientes para el terapeuta interno</w:t>
+      </w:r>
+    </w:p>
+    <w:p>
+      <w:pPr>
+        <w:spacing w:after="160"/>
+      </w:pPr>
+      <w:r>
+        <w:rPr>
+          <w:rFonts w:ascii="Arial" w:cs="Arial" w:eastAsia="Arial" w:hAnsi="Arial"/>
+          <w:color w:val="1F2937"/>
+          <w:sz w:val="24"/>
+          <w:szCs w:val="24"/>
+        </w:rPr>
+        <w:t xml:space="preserve">Se implementó el módulo completo de gestión de pacientes para el rol terapeuta interno. Incluye un nuevo endpoint backend con CRUD completo (GET lista, POST crear, GET detalle, PATCH editar, soft-delete de vínculos) y la página frontend Pacientes.jsx con los siguientes componentes:</w:t>
+      </w:r>
+    </w:p>
+    <w:p>
+      <w:pPr>
+        <w:spacing w:after="80"/>
+        <w:ind w:left="360"/>
+      </w:pPr>
+      <w:r>
+        <w:rPr>
+          <w:rFonts w:ascii="Arial" w:cs="Arial" w:eastAsia="Arial" w:hAnsi="Arial"/>
+          <w:color w:val="1F2937"/>
+          <w:sz w:val="24"/>
+          <w:szCs w:val="24"/>
+        </w:rPr>
+        <w:t xml:space="preserve">• ModalPaciente: formulario de alta y edición (nombre, apellido, fecha de nacimiento, sexo, estado activo).</w:t>
+      </w:r>
+    </w:p>
+    <w:p>
+      <w:pPr>
+        <w:spacing w:after="80"/>
+        <w:ind w:left="360"/>
+      </w:pPr>
+      <w:r>
+        <w:rPr>
+          <w:rFonts w:ascii="Arial" w:cs="Arial" w:eastAsia="Arial" w:hAnsi="Arial"/>
+          <w:color w:val="1F2937"/>
+          <w:sz w:val="24"/>
+          <w:szCs w:val="24"/>
+        </w:rPr>
+        <w:t xml:space="preserve">• ModalVincularFamiliar: selector de familiares disponibles con parentesco, tutor legal y autorizado médico.</w:t>
+      </w:r>
+    </w:p>
+    <w:p>
+      <w:pPr>
+        <w:spacing w:after="80"/>
+        <w:ind w:left="360"/>
+      </w:pPr>
+      <w:r>
+        <w:rPr>
+          <w:rFonts w:ascii="Arial" w:cs="Arial" w:eastAsia="Arial" w:hAnsi="Arial"/>
+          <w:color w:val="1F2937"/>
+          <w:sz w:val="24"/>
+          <w:szCs w:val="24"/>
+        </w:rPr>
+        <w:t xml:space="preserve">• FilaPaciente: fila expandible que muestra los familiares vinculados con opción de desvincular.</w:t>
+      </w:r>
+    </w:p>
+    <w:p>
+      <w:pPr>
+        <w:spacing w:after="160"/>
+        <w:ind w:left="360"/>
+      </w:pPr>
+      <w:r>
+        <w:rPr>
+          <w:rFonts w:ascii="Arial" w:cs="Arial" w:eastAsia="Arial" w:hAnsi="Arial"/>
+          <w:color w:val="1F2937"/>
+          <w:sz w:val="24"/>
+          <w:szCs w:val="24"/>
+        </w:rPr>
+        <w:t xml:space="preserve">• Búsqueda, filtro por activos y paginación. Navegación agregada al nav_config del rol ter-int.</w:t>
+      </w:r>
+    </w:p>
+    <w:p>
+      <w:pPr>
+        <w:spacing w:after="160" w:before="240"/>
+      </w:pPr>
+      <w:r>
+        <w:rPr>
+          <w:rFonts w:ascii="Arial" w:cs="Arial" w:eastAsia="Arial" w:hAnsi="Arial"/>
+          <w:b/>
+          <w:bCs/>
+          <w:color w:val="0D6B6E"/>
+          <w:sz w:val="26"/>
+          <w:szCs w:val="26"/>
+        </w:rPr>
+        <w:t>9.5 Estandarización de mensajes de feedback (toasts)</w:t>
+      </w:r>
+    </w:p>
+    <w:p>
+      <w:pPr>
+        <w:spacing w:after="160"/>
+      </w:pPr>
+      <w:r>
+        <w:rPr>
+          <w:rFonts w:ascii="Arial" w:cs="Arial" w:eastAsia="Arial" w:hAnsi="Arial"/>
+          <w:color w:val="1F2937"/>
+          <w:sz w:val="24"/>
+          <w:szCs w:val="24"/>
+        </w:rPr>
+        <w:t xml:space="preserve">Se estandarizaron todos los mensajes de feedback (toasts) en la aplicación. El nuevo criterio es: éxito→ parte inferior centrada, fondo verde azulado (--teal, #1D9E75), texto blanco; error→ parte inferior centrada, fondo rojo (--red, #A32D2D), texto blanco. Se actualizó global.css con las clases .toast y .toast.error, y se migró el estado de useState(‘’) a useState({ msg: ‘’, ok: true }) en nueve páginas: admin/Usuarios, admin/Dashboard, terapeuta/interno/Alertas, Registros, Actividades, Conocimiento, Pacientes, terapeuta/externo/Registros y familiar/Actividades.</w:t>
+      </w:r>
+    </w:p>
+    <w:p>
+      <w:pPr>
+        <w:spacing w:after="160" w:before="240"/>
+      </w:pPr>
+      <w:r>
+        <w:rPr>
+          <w:rFonts w:ascii="Arial" w:cs="Arial" w:eastAsia="Arial" w:hAnsi="Arial"/>
+          <w:b/>
+          <w:bCs/>
+          <w:color w:val="0D6B6E"/>
+          <w:sz w:val="26"/>
+          <w:szCs w:val="26"/>
+        </w:rPr>
+        <w:t>9.6 Vista “Mis parientes” para el rol familiar</w:t>
+      </w:r>
+    </w:p>
+    <w:p>
+      <w:pPr>
+        <w:spacing w:after="160"/>
+      </w:pPr>
+      <w:r>
+        <w:rPr>
+          <w:rFonts w:ascii="Arial" w:cs="Arial" w:eastAsia="Arial" w:hAnsi="Arial"/>
+          <w:color w:val="1F2937"/>
+          <w:sz w:val="24"/>
+          <w:szCs w:val="24"/>
+        </w:rPr>
+        <w:t xml:space="preserve">Se agregó la sección “Mis parientes” al panel familiar, permitiendo que el usuario con rol familia vea todos los pacientes vinculados a su cuenta. Se creó el endpoint GET /familiar/mis-vinculos en dashboard_router.py y la página MisParientes.jsx con tarjetas que muestran nombre, parentesco, edad, nivel de soporte TEA y permisos (tutor legal, autorizado médico). La navegación se incorporó al nav_config del rol familia en main.py y al SCREEN_TO_PATH de AppShell.jsx.</w:t>
+      </w:r>
+    </w:p>
+    <w:p>
+      <w:pPr>
+        <w:spacing w:after="160" w:before="240"/>
+      </w:pPr>
+      <w:r>
+        <w:rPr>
+          <w:rFonts w:ascii="Arial" w:cs="Arial" w:eastAsia="Arial" w:hAnsi="Arial"/>
+          <w:b/>
+          <w:bCs/>
+          <w:color w:val="0D6B6E"/>
+          <w:sz w:val="26"/>
+          <w:szCs w:val="26"/>
+        </w:rPr>
+        <w:t>9.7 Archivos creados / modificados en esta fase</w:t>
+      </w:r>
+    </w:p>
+    <w:p>
+      <w:pPr>
+        <w:spacing w:after="80"/>
+        <w:ind w:left="360"/>
+      </w:pPr>
+      <w:r>
+        <w:rPr>
+          <w:rFonts w:ascii="Arial" w:cs="Arial" w:eastAsia="Arial" w:hAnsi="Arial"/>
+          <w:color w:val="1F2937"/>
+          <w:sz w:val="24"/>
+          <w:szCs w:val="24"/>
+        </w:rPr>
+        <w:t xml:space="preserve">• backend/app/main.py — nav_config actualizado (roles familia y ter-int), seed de parentescos, seed de reglas IA.</w:t>
+      </w:r>
+    </w:p>
+    <w:p>
+      <w:pPr>
+        <w:spacing w:after="80"/>
+        <w:ind w:left="360"/>
+      </w:pPr>
+      <w:r>
+        <w:rPr>
+          <w:rFonts w:ascii="Arial" w:cs="Arial" w:eastAsia="Arial" w:hAnsi="Arial"/>
+          <w:color w:val="1F2937"/>
+          <w:sz w:val="24"/>
+          <w:szCs w:val="24"/>
+        </w:rPr>
+        <w:t xml:space="preserve">• backend/app/api/paciente_router.py — CRUD de pacientes, vinculación con familiares, catálogo de parentescos.</w:t>
+      </w:r>
+    </w:p>
+    <w:p>
+      <w:pPr>
+        <w:spacing w:after="80"/>
+        <w:ind w:left="360"/>
+      </w:pPr>
+      <w:r>
+        <w:rPr>
+          <w:rFonts w:ascii="Arial" w:cs="Arial" w:eastAsia="Arial" w:hAnsi="Arial"/>
+          <w:color w:val="1F2937"/>
+          <w:sz w:val="24"/>
+          <w:szCs w:val="24"/>
+        </w:rPr>
+        <w:t xml:space="preserve">• backend/app/api/dashboard_router.py — nuevo endpoint GET /familiar/mis-vinculos.</w:t>
+      </w:r>
+    </w:p>
+    <w:p>
+      <w:pPr>
+        <w:spacing w:after="80"/>
+        <w:ind w:left="360"/>
+      </w:pPr>
+      <w:r>
+        <w:rPr>
+          <w:rFonts w:ascii="Arial" w:cs="Arial" w:eastAsia="Arial" w:hAnsi="Arial"/>
+          <w:color w:val="1F2937"/>
+          <w:sz w:val="24"/>
+          <w:szCs w:val="24"/>
+        </w:rPr>
+        <w:t xml:space="preserve">• frontend/src/pages/terapeuta/interno/Pacientes.jsx — nueva página de gestión de pacientes.</w:t>
+      </w:r>
+    </w:p>
+    <w:p>
+      <w:pPr>
+        <w:spacing w:after="80"/>
+        <w:ind w:left="360"/>
+      </w:pPr>
+      <w:r>
+        <w:rPr>
+          <w:rFonts w:ascii="Arial" w:cs="Arial" w:eastAsia="Arial" w:hAnsi="Arial"/>
+          <w:color w:val="1F2937"/>
+          <w:sz w:val="24"/>
+          <w:szCs w:val="24"/>
+        </w:rPr>
+        <w:t xml:space="preserve">• frontend/src/pages/familiar/MisParientes.jsx — nueva página de parientes vinculados.</w:t>
+      </w:r>
+    </w:p>
+    <w:p>
+      <w:pPr>
+        <w:spacing w:after="80"/>
+        <w:ind w:left="360"/>
+      </w:pPr>
+      <w:r>
+        <w:rPr>
+          <w:rFonts w:ascii="Arial" w:cs="Arial" w:eastAsia="Arial" w:hAnsi="Arial"/>
+          <w:color w:val="1F2937"/>
+          <w:sz w:val="24"/>
+          <w:szCs w:val="24"/>
+        </w:rPr>
+        <w:t xml:space="preserve">• frontend/src/styles/global.css — clases .toast (fondo teal) y .toast.error (fondo rojo) estandarizadas.</w:t>
+      </w:r>
+    </w:p>
+    <w:p>
+      <w:pPr>
+        <w:spacing w:after="80"/>
+        <w:ind w:left="360"/>
+      </w:pPr>
+      <w:r>
+        <w:rPr>
+          <w:rFonts w:ascii="Arial" w:cs="Arial" w:eastAsia="Arial" w:hAnsi="Arial"/>
+          <w:color w:val="1F2937"/>
+          <w:sz w:val="24"/>
+          <w:szCs w:val="24"/>
+        </w:rPr>
+        <w:t xml:space="preserve">• frontend/src/router/index.jsx — rutas /terapeuta/interno/pacientes y /familiar/mis-parientes.</w:t>
+      </w:r>
+    </w:p>
+    <w:p>
+      <w:pPr>
+        <w:spacing w:after="80"/>
+        <w:ind w:left="360"/>
+      </w:pPr>
+      <w:r>
+        <w:rPr>
+          <w:rFonts w:ascii="Arial" w:cs="Arial" w:eastAsia="Arial" w:hAnsi="Arial"/>
+          <w:color w:val="1F2937"/>
+          <w:sz w:val="24"/>
+          <w:szCs w:val="24"/>
+        </w:rPr>
+        <w:t xml:space="preserve">• frontend/src/components/layout/AppShell.jsx — SCREEN_TO_PATH ampliado con ter-int-pacientes y mis-parientes.</w:t>
+      </w:r>
+    </w:p>
+    <w:p>
+      <w:pPr>
+        <w:spacing w:after="160"/>
+        <w:ind w:left="360"/>
+      </w:pPr>
+      <w:r>
+        <w:rPr>
+          <w:rFonts w:ascii="Arial" w:cs="Arial" w:eastAsia="Arial" w:hAnsi="Arial"/>
+          <w:color w:val="1F2937"/>
+          <w:sz w:val="24"/>
+          <w:szCs w:val="24"/>
+        </w:rPr>
+        <w:t xml:space="preserve">• 9 páginas JSX actualizadas con el patrón de toast estandarizado ({ msg, ok }).</w:t>
+      </w:r>
+    </w:p>
+    <w:p>
+      <w:pPr>
         <w:pBdr>
           <w:top w:val="single" w:color="D1D5DB" w:sz="4" w:space="8"/>
         </w:pBdr>
@@ -14673,7 +15197,7 @@
           <w:sz w:val="18"/>
           <w:szCs w:val="18"/>
         </w:rPr>
-        <w:t xml:space="preserve">Acompañarte · Documentación Técnica v1.0 · Abril 2026</w:t>
+        <w:t xml:space="preserve">Acompañarte · Documentación Técnica v1.1 · Mayo 2026</w:t>
       </w:r>
     </w:p>
     <w:sectPr>

</xml_diff>

<commit_message>
feat: familiar a cargo en alta de paciente + documentación actualizada
- Pacientes.jsx: el modal de alta ahora incluye sección "Familiar a cargo"
  (opcional). Carga familiares y parentescos disponibles; si se elige uno,
  vincula automáticamente después de crear el paciente.
- Documentacion_Tecnica.docx: Sección 15 — Iteración 10.
- Manual_de_Usuario.docx: login rediseñado, sección 6.6 admin, nota familiar.
- Informe_de_Evolucion.docx: métricas actualizadas (10 iter, 24 pantallas).

Co-Authored-By: Claude Sonnet 4.6 <noreply@anthropic.com>
</commit_message>
<xml_diff>
--- a/Documentacion_Tecnica_Acompanarte.docx
+++ b/Documentacion_Tecnica_Acompanarte.docx
@@ -80,7 +80,7 @@
           <w:sz w:val="24"/>
           <w:szCs w:val="24"/>
         </w:rPr>
-        <w:t xml:space="preserve">v1.5 · Mayo 2026</w:t>
+        <w:t xml:space="preserve">v1.6 · Mayo 2026</w:t>
       </w:r>
     </w:p>
     <w:p>
@@ -9445,6 +9445,1726 @@
         <w:t xml:space="preserve">verificar_entorno.sh — script bash para verificar e instalar Docker, Ollama y el modelo en el VPS (referencia para futuros despliegues en servidores nuevos).</w:t>
       </w:r>
     </w:p>
+    <w:p>
+      <w:pPr>
+        <w:pStyle w:val="Heading1"/>
+        <w:spacing w:after="120" w:before="360"/>
+      </w:pPr>
+      <w:r>
+        <w:rPr>
+          <w:rFonts w:ascii="Arial" w:cs="Arial" w:eastAsia="Arial" w:hAnsi="Arial"/>
+          <w:b/>
+          <w:bCs/>
+          <w:color w:val="0D6B6E"/>
+          <w:sz w:val="32"/>
+          <w:szCs w:val="32"/>
+        </w:rPr>
+        <w:t xml:space="preserve">14. Correcciones y nueva funcionalidad (Mayo 2026 — Sexta fase)</w:t>
+      </w:r>
+    </w:p>
+    <w:p>
+      <w:pPr>
+        <w:spacing w:after="60" w:before="60" w:line="276"/>
+      </w:pPr>
+      <w:r>
+        <w:rPr>
+          <w:rFonts w:ascii="Arial" w:cs="Arial" w:eastAsia="Arial" w:hAnsi="Arial"/>
+          <w:color w:val="4A5568"/>
+          <w:sz w:val="22"/>
+          <w:szCs w:val="22"/>
+        </w:rPr>
+        <w:t xml:space="preserve">Esta fase abarca la corrección de tres bugs detectados en el módulo de IA y el shell principal, la unificación del modelo Ollama entre entornos, y la implementación de una nueva funcionalidad completa: el módulo de Contactos TEA para el rol Terapeuta Interno. También se agregó protección para evitar la desactivación accidental del único administrador activo del sistema.</w:t>
+      </w:r>
+    </w:p>
+    <w:p>
+      <w:pPr>
+        <w:pStyle w:val="Heading2"/>
+        <w:spacing w:after="80" w:before="240"/>
+      </w:pPr>
+      <w:r>
+        <w:rPr>
+          <w:rFonts w:ascii="Arial" w:cs="Arial" w:eastAsia="Arial" w:hAnsi="Arial"/>
+          <w:b/>
+          <w:bCs/>
+          <w:color w:val="0D6B6E"/>
+          <w:sz w:val="26"/>
+          <w:szCs w:val="26"/>
+        </w:rPr>
+        <w:t xml:space="preserve">14.1 Bug: campo alerta faltante en ChatResponse del asistente familiar</w:t>
+      </w:r>
+    </w:p>
+    <w:p>
+      <w:pPr>
+        <w:spacing w:after="60" w:before="60" w:line="276"/>
+      </w:pPr>
+      <w:r>
+        <w:rPr>
+          <w:rFonts w:ascii="Arial" w:cs="Arial" w:eastAsia="Arial" w:hAnsi="Arial"/>
+          <w:color w:val="4A5568"/>
+          <w:sz w:val="22"/>
+          <w:szCs w:val="22"/>
+        </w:rPr>
+        <w:t xml:space="preserve">Síntoma: el asistente de chat del rol Familiar detectaba correctamente situaciones de alerta en el pipeline RAG (campo alerta=True en el resultado interno), pero el frontend nunca mostraba el banner de notificación al equipo terapéutico.</w:t>
+      </w:r>
+    </w:p>
+    <w:p>
+      <w:pPr>
+        <w:spacing w:after="60" w:before="60" w:line="276"/>
+      </w:pPr>
+      <w:r>
+        <w:rPr>
+          <w:rFonts w:ascii="Arial" w:cs="Arial" w:eastAsia="Arial" w:hAnsi="Arial"/>
+          <w:color w:val="4A5568"/>
+          <w:sz w:val="22"/>
+          <w:szCs w:val="22"/>
+        </w:rPr>
+        <w:t xml:space="preserve">Causa: el schema Pydantic ChatResponse en sesion_ia_router.py no declaraba el campo alerta, por lo que FastAPI lo omitía del JSON de respuesta. El endpoint tampoco lo incluía en el return. El frontend recibía data.alerta === undefined, que nunca activa el banner.</w:t>
+      </w:r>
+    </w:p>
+    <w:p>
+      <w:pPr>
+        <w:spacing w:after="60" w:before="60" w:line="276"/>
+      </w:pPr>
+      <w:r>
+        <w:rPr>
+          <w:rFonts w:ascii="Arial" w:cs="Arial" w:eastAsia="Arial" w:hAnsi="Arial"/>
+          <w:color w:val="4A5568"/>
+          <w:sz w:val="22"/>
+          <w:szCs w:val="22"/>
+        </w:rPr>
+        <w:t xml:space="preserve">Corrección backend: se agregó alerta: bool = False al schema ChatResponse y se actualizó el return del endpoint /ia/chat con alerta=resultado.get("alerta", False). Corrección frontend (Asistente.jsx): se agregó estado alertaBanner (null | “visible” | “descartado”) y el banner se activa con if (data.alerta &amp;&amp; alertaBanner === null). El banner tiene estilos de alerta (borde rojo suave) y botón para descartarlo.</w:t>
+      </w:r>
+    </w:p>
+    <w:p>
+      <w:pPr>
+        <w:pStyle w:val="Heading2"/>
+        <w:spacing w:after="80" w:before="240"/>
+      </w:pPr>
+      <w:r>
+        <w:rPr>
+          <w:rFonts w:ascii="Arial" w:cs="Arial" w:eastAsia="Arial" w:hAnsi="Arial"/>
+          <w:b/>
+          <w:bCs/>
+          <w:color w:val="0D6B6E"/>
+          <w:sz w:val="26"/>
+          <w:szCs w:val="26"/>
+        </w:rPr>
+        <w:t xml:space="preserve">14.2 Bug: doble respuesta del asistente en modo desarrollo (StrictMode)</w:t>
+      </w:r>
+    </w:p>
+    <w:p>
+      <w:pPr>
+        <w:spacing w:after="60" w:before="60" w:line="276"/>
+      </w:pPr>
+      <w:r>
+        <w:rPr>
+          <w:rFonts w:ascii="Arial" w:cs="Arial" w:eastAsia="Arial" w:hAnsi="Arial"/>
+          <w:color w:val="4A5568"/>
+          <w:sz w:val="22"/>
+          <w:szCs w:val="22"/>
+        </w:rPr>
+        <w:t xml:space="preserve">Síntoma: en modo desarrollo, al enviar un mensaje al asistente familiar, la IA respondía con dos burbujas de texto. El bug no se reproducía en producción.</w:t>
+      </w:r>
+    </w:p>
+    <w:p>
+      <w:pPr>
+        <w:spacing w:after="60" w:before="60" w:line="276"/>
+      </w:pPr>
+      <w:r>
+        <w:rPr>
+          <w:rFonts w:ascii="Arial" w:cs="Arial" w:eastAsia="Arial" w:hAnsi="Arial"/>
+          <w:color w:val="4A5568"/>
+          <w:sz w:val="22"/>
+          <w:szCs w:val="22"/>
+        </w:rPr>
+        <w:t xml:space="preserve">Causa: React 18 en modo StrictMode ejecuta los efectos dos veces para detectar efectos secundarios. La función enviar() usaba el estado loading (booleano React) como guard de concurrencia. Como setState es asíncrono, dos llamadas casi simultáneas podían pasar el guard antes de que la primera actualizara el estado.</w:t>
+      </w:r>
+    </w:p>
+    <w:p>
+      <w:pPr>
+        <w:spacing w:after="60" w:before="60" w:line="276"/>
+      </w:pPr>
+      <w:r>
+        <w:rPr>
+          <w:rFonts w:ascii="Arial" w:cs="Arial" w:eastAsia="Arial" w:hAnsi="Arial"/>
+          <w:color w:val="4A5568"/>
+          <w:sz w:val="22"/>
+          <w:szCs w:val="22"/>
+        </w:rPr>
+        <w:t xml:space="preserve">Corrección: se reemplazó el guard basado en estado por un ref sincrónico: const enviandoRef = useRef(false). Al entrar a enviar() se verifica enviandoRef.current y se setea a true inmediatamente (síncrono). En el bloque finally se resetea a false. Los refs en React son actualizados de forma síncrona y no causan re-renders, eliminando la condición de carrera.</w:t>
+      </w:r>
+    </w:p>
+    <w:p>
+      <w:pPr>
+        <w:pStyle w:val="Heading2"/>
+        <w:spacing w:after="80" w:before="240"/>
+      </w:pPr>
+      <w:r>
+        <w:rPr>
+          <w:rFonts w:ascii="Arial" w:cs="Arial" w:eastAsia="Arial" w:hAnsi="Arial"/>
+          <w:b/>
+          <w:bCs/>
+          <w:color w:val="0D6B6E"/>
+          <w:sz w:val="26"/>
+          <w:szCs w:val="26"/>
+        </w:rPr>
+        <w:t xml:space="preserve">14.3 Bug: banner de contacto en AsistentePublico con estilos de burbuja IA</w:t>
+      </w:r>
+    </w:p>
+    <w:p>
+      <w:pPr>
+        <w:spacing w:after="60" w:before="60" w:line="276"/>
+      </w:pPr>
+      <w:r>
+        <w:rPr>
+          <w:rFonts w:ascii="Arial" w:cs="Arial" w:eastAsia="Arial" w:hAnsi="Arial"/>
+          <w:color w:val="4A5568"/>
+          <w:sz w:val="22"/>
+          <w:szCs w:val="22"/>
+        </w:rPr>
+        <w:t xml:space="preserve">Síntoma: cuando el asistente público detectaba una señal de alerta y ofrecía contacto con un terapeuta, el banner de contacto tenía el mismo borderRadius que las burbujas de la IA (12px 12px 12px 2px), por lo que los usuarios lo interpretaban como una segunda respuesta del bot en lugar de una acción especial.</w:t>
+      </w:r>
+    </w:p>
+    <w:p>
+      <w:pPr>
+        <w:spacing w:after="60" w:before="60" w:line="276"/>
+      </w:pPr>
+      <w:r>
+        <w:rPr>
+          <w:rFonts w:ascii="Arial" w:cs="Arial" w:eastAsia="Arial" w:hAnsi="Arial"/>
+          <w:color w:val="4A5568"/>
+          <w:sz w:val="22"/>
+          <w:szCs w:val="22"/>
+        </w:rPr>
+        <w:t xml:space="preserve">Corrección: se rediseñó el banner con borderRadius uniforme (10px), icono 🤝 destacado, etiqueta “Atención especializada disponible” en color teal, y estructura visual claramente diferenciada de las burbujas de chat.</w:t>
+      </w:r>
+    </w:p>
+    <w:p>
+      <w:pPr>
+        <w:pStyle w:val="Heading2"/>
+        <w:spacing w:after="80" w:before="240"/>
+      </w:pPr>
+      <w:r>
+        <w:rPr>
+          <w:rFonts w:ascii="Arial" w:cs="Arial" w:eastAsia="Arial" w:hAnsi="Arial"/>
+          <w:b/>
+          <w:bCs/>
+          <w:color w:val="0D6B6E"/>
+          <w:sz w:val="26"/>
+          <w:szCs w:val="26"/>
+        </w:rPr>
+        <w:t xml:space="preserve">14.4 Bug: doble prefijo /api/v1 en AppShell al cargar badge de alertas</w:t>
+      </w:r>
+    </w:p>
+    <w:p>
+      <w:pPr>
+        <w:spacing w:after="60" w:before="60" w:line="276"/>
+      </w:pPr>
+      <w:r>
+        <w:rPr>
+          <w:rFonts w:ascii="Arial" w:cs="Arial" w:eastAsia="Arial" w:hAnsi="Arial"/>
+          <w:color w:val="4A5568"/>
+          <w:sz w:val="22"/>
+          <w:szCs w:val="22"/>
+        </w:rPr>
+        <w:t xml:space="preserve">Síntoma: el badge de alertas en el sidebar de AppShell funcionaba en desarrollo pero devolvía 404 en producción.</w:t>
+      </w:r>
+    </w:p>
+    <w:p>
+      <w:pPr>
+        <w:spacing w:after="60" w:before="60" w:line="276"/>
+      </w:pPr>
+      <w:r>
+        <w:rPr>
+          <w:rFonts w:ascii="Arial" w:cs="Arial" w:eastAsia="Arial" w:hAnsi="Arial"/>
+          <w:color w:val="4A5568"/>
+          <w:sz w:val="22"/>
+          <w:szCs w:val="22"/>
+        </w:rPr>
+        <w:t xml:space="preserve">Causa: la función authFetch en AuthContext.jsx construye la URL como API_BASE + url, donde API_BASE ya incluye /api/v1 (VITE_API_URL=http://localhost:8000/api/v1 en dev, /api/v1 en prod). En AppShell, la llamada usaba authFetch(‘/api/v1/alertas/...’), resultando en /api/v1/api/v1/alertas/ en producción.</w:t>
+      </w:r>
+    </w:p>
+    <w:p>
+      <w:pPr>
+        <w:spacing w:after="60" w:before="60" w:line="276"/>
+      </w:pPr>
+      <w:r>
+        <w:rPr>
+          <w:rFonts w:ascii="Arial" w:cs="Arial" w:eastAsia="Arial" w:hAnsi="Arial"/>
+          <w:color w:val="4A5568"/>
+          <w:sz w:val="22"/>
+          <w:szCs w:val="22"/>
+        </w:rPr>
+        <w:t xml:space="preserve">Corrección: se eliminó el prefijo /api/v1 de la llamada, dejando authFetch(‘/alertas/?solo_pendientes=true&amp;limit=50’). Se documentó en AuthContext.jsx que todos los llamadores de authFetch deben omitir el prefijo /api/v1.</w:t>
+      </w:r>
+    </w:p>
+    <w:p>
+      <w:pPr>
+        <w:pStyle w:val="Heading2"/>
+        <w:spacing w:after="80" w:before="240"/>
+      </w:pPr>
+      <w:r>
+        <w:rPr>
+          <w:rFonts w:ascii="Arial" w:cs="Arial" w:eastAsia="Arial" w:hAnsi="Arial"/>
+          <w:b/>
+          <w:bCs/>
+          <w:color w:val="0D6B6E"/>
+          <w:sz w:val="26"/>
+          <w:szCs w:val="26"/>
+        </w:rPr>
+        <w:t xml:space="preserve">14.5 Unificación del modelo Ollama entre desarrollo y producción</w:t>
+      </w:r>
+    </w:p>
+    <w:p>
+      <w:pPr>
+        <w:spacing w:after="60" w:before="60" w:line="276"/>
+      </w:pPr>
+      <w:r>
+        <w:rPr>
+          <w:rFonts w:ascii="Arial" w:cs="Arial" w:eastAsia="Arial" w:hAnsi="Arial"/>
+          <w:color w:val="4A5568"/>
+          <w:sz w:val="22"/>
+          <w:szCs w:val="22"/>
+        </w:rPr>
+        <w:t xml:space="preserve">El docker-compose.yml de desarrollo tenía como modelo por defecto llama3.1:8b, mientras que producción usaba qwen2.5:3b. Esta diferencia causaba comportamientos distintos del asistente IA entre ambos entornos. Se unificó el valor por defecto en docker-compose.yml a qwen2.5:3b para que el comportamiento sea idéntico. El modelo puede sobreescribirse con la variable de entorno OLLAMA_MODEL en el .env correspondiente.</w:t>
+      </w:r>
+    </w:p>
+    <w:p>
+      <w:pPr>
+        <w:pStyle w:val="Heading2"/>
+        <w:spacing w:after="80" w:before="240"/>
+      </w:pPr>
+      <w:r>
+        <w:rPr>
+          <w:rFonts w:ascii="Arial" w:cs="Arial" w:eastAsia="Arial" w:hAnsi="Arial"/>
+          <w:b/>
+          <w:bCs/>
+          <w:color w:val="0D6B6E"/>
+          <w:sz w:val="26"/>
+          <w:szCs w:val="26"/>
+        </w:rPr>
+        <w:t xml:space="preserve">14.6 Nueva funcionalidad: módulo Contactos TEA para Terapeuta Interno</w:t>
+      </w:r>
+    </w:p>
+    <w:p>
+      <w:pPr>
+        <w:spacing w:after="60" w:before="60" w:line="276"/>
+      </w:pPr>
+      <w:r>
+        <w:rPr>
+          <w:rFonts w:ascii="Arial" w:cs="Arial" w:eastAsia="Arial" w:hAnsi="Arial"/>
+          <w:color w:val="4A5568"/>
+          <w:sz w:val="22"/>
+          <w:szCs w:val="22"/>
+        </w:rPr>
+        <w:t xml:space="preserve">Se implementó el ciclo completo de atención de contactos TEA para el rol terapeuta interno. Cuando el administrador deriva un ContactoPublico a un terapeuta, este ahora puede verlo y resolverlo directamente desde su panel, sin depender del admin para el alta del usuario familiar.</w:t>
+      </w:r>
+    </w:p>
+    <w:p>
+      <w:pPr>
+        <w:spacing w:after="60" w:before="60" w:line="276"/>
+      </w:pPr>
+      <w:r>
+        <w:rPr>
+          <w:rFonts w:ascii="Arial" w:cs="Arial" w:eastAsia="Arial" w:hAnsi="Arial"/>
+          <w:b/>
+          <w:bCs/>
+          <w:color w:val="4A5568"/>
+          <w:sz w:val="22"/>
+          <w:szCs w:val="22"/>
+        </w:rPr>
+        <w:t xml:space="preserve">Backend — ter_int_contactos_router.py:</w:t>
+      </w:r>
+    </w:p>
+    <w:p>
+      <w:pPr>
+        <w:pStyle w:val="ListParagraph"/>
+        <w:numPr>
+          <w:ilvl w:val="0"/>
+          <w:numId w:val="2"/>
+        </w:numPr>
+        <w:spacing w:after="40" w:before="40" w:line="276"/>
+      </w:pPr>
+      <w:r>
+        <w:rPr>
+          <w:rFonts w:ascii="Arial" w:cs="Arial" w:eastAsia="Arial" w:hAnsi="Arial"/>
+          <w:color w:val="4A5568"/>
+          <w:sz w:val="22"/>
+          <w:szCs w:val="22"/>
+        </w:rPr>
+        <w:t xml:space="preserve">GET /ter-int/contactos: lista los ContactoPublico donde derivado_a_id coincide con el terapeuta autenticado. Filtrable por ?estado=derivado|atendido|no_atendido.</w:t>
+      </w:r>
+    </w:p>
+    <w:p>
+      <w:pPr>
+        <w:pStyle w:val="ListParagraph"/>
+        <w:numPr>
+          <w:ilvl w:val="0"/>
+          <w:numId w:val="2"/>
+        </w:numPr>
+        <w:spacing w:after="40" w:before="40" w:line="276"/>
+      </w:pPr>
+      <w:r>
+        <w:rPr>
+          <w:rFonts w:ascii="Arial" w:cs="Arial" w:eastAsia="Arial" w:hAnsi="Arial"/>
+          <w:color w:val="4A5568"/>
+          <w:sz w:val="22"/>
+          <w:szCs w:val="22"/>
+        </w:rPr>
+        <w:t xml:space="preserve">POST /ter-int/contactos/{id}/atender: verifica que el contacto es del terapeuta, crea un Usuario con rol familia y activo=False más su perfil Familiar, y marca el contacto como “atendido”. Si el email ya existe en la BD, no duplica el usuario sino que solo cierra el contacto. La contraseña inicial es aleatoria; el admin deberá activar la cuenta.</w:t>
+      </w:r>
+    </w:p>
+    <w:p>
+      <w:pPr>
+        <w:pStyle w:val="ListParagraph"/>
+        <w:numPr>
+          <w:ilvl w:val="0"/>
+          <w:numId w:val="2"/>
+        </w:numPr>
+        <w:spacing w:after="40" w:before="40" w:line="276"/>
+      </w:pPr>
+      <w:r>
+        <w:rPr>
+          <w:rFonts w:ascii="Arial" w:cs="Arial" w:eastAsia="Arial" w:hAnsi="Arial"/>
+          <w:color w:val="4A5568"/>
+          <w:sz w:val="22"/>
+          <w:szCs w:val="22"/>
+        </w:rPr>
+        <w:t xml:space="preserve">POST /ter-int/contactos/{id}/no-atender: marca el contacto como “no_atendido”. El admin puede re-derivarlo a otro terapeuta si corresponde.</w:t>
+      </w:r>
+    </w:p>
+    <w:p>
+      <w:pPr>
+        <w:spacing w:after="60" w:before="60" w:line="276"/>
+      </w:pPr>
+      <w:r>
+        <w:rPr>
+          <w:rFonts w:ascii="Arial" w:cs="Arial" w:eastAsia="Arial" w:hAnsi="Arial"/>
+          <w:b/>
+          <w:bCs/>
+          <w:color w:val="4A5568"/>
+          <w:sz w:val="22"/>
+          <w:szCs w:val="22"/>
+        </w:rPr>
+        <w:t xml:space="preserve">Frontend — ContactosDerivados.jsx:</w:t>
+      </w:r>
+    </w:p>
+    <w:p>
+      <w:pPr>
+        <w:spacing w:after="60" w:before="60" w:line="276"/>
+      </w:pPr>
+      <w:r>
+        <w:rPr>
+          <w:rFonts w:ascii="Arial" w:cs="Arial" w:eastAsia="Arial" w:hAnsi="Arial"/>
+          <w:color w:val="4A5568"/>
+          <w:sz w:val="22"/>
+          <w:szCs w:val="22"/>
+        </w:rPr>
+        <w:t xml:space="preserve">Página para el rol ter-int que muestra la lista de contactos derivados con badges de estado (Pendiente / Atendido / No Atendido), resumen de conteos, filtros por estado, detalle expandible con el intercambio que activó la alerta, y botones de acción. Al presionar “Atender” se abre un modal para ingresar nombre, apellido y email del futuro familiar; el sistema crea el usuario y muestra confirmación. La nueva sección “Contactos TEA” fue agregada al nav_config del rol ter-int en el sidebar (ícono mail). La ruta es /terapeuta/interno/contactos.</w:t>
+      </w:r>
+    </w:p>
+    <w:p>
+      <w:pPr>
+        <w:pStyle w:val="Heading2"/>
+        <w:spacing w:after="80" w:before="240"/>
+      </w:pPr>
+      <w:r>
+        <w:rPr>
+          <w:rFonts w:ascii="Arial" w:cs="Arial" w:eastAsia="Arial" w:hAnsi="Arial"/>
+          <w:b/>
+          <w:bCs/>
+          <w:color w:val="0D6B6E"/>
+          <w:sz w:val="26"/>
+          <w:szCs w:val="26"/>
+        </w:rPr>
+        <w:t xml:space="preserve">14.7 Protección del único administrador activo</w:t>
+      </w:r>
+    </w:p>
+    <w:p>
+      <w:pPr>
+        <w:spacing w:after="60" w:before="60" w:line="276"/>
+      </w:pPr>
+      <w:r>
+        <w:rPr>
+          <w:rFonts w:ascii="Arial" w:cs="Arial" w:eastAsia="Arial" w:hAnsi="Arial"/>
+          <w:color w:val="4A5568"/>
+          <w:sz w:val="22"/>
+          <w:szCs w:val="22"/>
+        </w:rPr>
+        <w:t xml:space="preserve">Se agregó una protección en el endpoint PUT /usuarios/{id}: si se intenta establecer activo=False sobre un usuario con rol admin y ese es el único administrador activo del sistema, el endpoint devuelve HTTP 409 con el mensaje “No podés desactivar al único administrador activo del sistema. Creá otro admin primero”. La verificación cuenta los admins activos excluyendo al usuario que se quiere modificar.</w:t>
+      </w:r>
+    </w:p>
+    <w:p>
+      <w:pPr>
+        <w:spacing w:after="60" w:before="60" w:line="276"/>
+      </w:pPr>
+      <w:r>
+        <w:rPr>
+          <w:rFonts w:ascii="Arial" w:cs="Arial" w:eastAsia="Arial" w:hAnsi="Arial"/>
+          <w:color w:val="4A5568"/>
+          <w:sz w:val="22"/>
+          <w:szCs w:val="22"/>
+        </w:rPr>
+        <w:t xml:space="preserve">Motivación: durante el desarrollo, el admin fue desactivado por error desde el panel de Usuarios, dejando el sistema sin ningún acceso administrativo. La recuperación requirió acceso directo a la BD vía psql para reactivarlo manualmente.</w:t>
+      </w:r>
+    </w:p>
+    <w:p>
+      <w:pPr>
+        <w:pStyle w:val="Heading2"/>
+        <w:spacing w:after="80" w:before="240"/>
+      </w:pPr>
+      <w:r>
+        <w:rPr>
+          <w:rFonts w:ascii="Arial" w:cs="Arial" w:eastAsia="Arial" w:hAnsi="Arial"/>
+          <w:b/>
+          <w:bCs/>
+          <w:color w:val="0D6B6E"/>
+          <w:sz w:val="26"/>
+          <w:szCs w:val="26"/>
+        </w:rPr>
+        <w:t xml:space="preserve">14.8 Archivos modificados en esta fase</w:t>
+      </w:r>
+    </w:p>
+    <w:p>
+      <w:pPr>
+        <w:pStyle w:val="ListParagraph"/>
+        <w:numPr>
+          <w:ilvl w:val="0"/>
+          <w:numId w:val="2"/>
+        </w:numPr>
+        <w:spacing w:after="40" w:before="40" w:line="276"/>
+      </w:pPr>
+      <w:r>
+        <w:rPr>
+          <w:rFonts w:ascii="Arial" w:cs="Arial" w:eastAsia="Arial" w:hAnsi="Arial"/>
+          <w:color w:val="4A5568"/>
+          <w:sz w:val="22"/>
+          <w:szCs w:val="22"/>
+        </w:rPr>
+        <w:t xml:space="preserve">backend/app/api/sesion_ia_router.py — campo alerta: bool = False agregado a ChatResponse; return del endpoint /ia/chat actualizado con alerta=resultado.get("alerta", False).</w:t>
+      </w:r>
+    </w:p>
+    <w:p>
+      <w:pPr>
+        <w:pStyle w:val="ListParagraph"/>
+        <w:numPr>
+          <w:ilvl w:val="0"/>
+          <w:numId w:val="2"/>
+        </w:numPr>
+        <w:spacing w:after="40" w:before="40" w:line="276"/>
+      </w:pPr>
+      <w:r>
+        <w:rPr>
+          <w:rFonts w:ascii="Arial" w:cs="Arial" w:eastAsia="Arial" w:hAnsi="Arial"/>
+          <w:color w:val="4A5568"/>
+          <w:sz w:val="22"/>
+          <w:szCs w:val="22"/>
+        </w:rPr>
+        <w:t xml:space="preserve">frontend/src/pages/familiar/Asistente.jsx — enviandoRef para guard sincrónico anti-doble-envío; estado alertaBanner y banner de alerta terapéutica.</w:t>
+      </w:r>
+    </w:p>
+    <w:p>
+      <w:pPr>
+        <w:pStyle w:val="ListParagraph"/>
+        <w:numPr>
+          <w:ilvl w:val="0"/>
+          <w:numId w:val="2"/>
+        </w:numPr>
+        <w:spacing w:after="40" w:before="40" w:line="276"/>
+      </w:pPr>
+      <w:r>
+        <w:rPr>
+          <w:rFonts w:ascii="Arial" w:cs="Arial" w:eastAsia="Arial" w:hAnsi="Arial"/>
+          <w:color w:val="4A5568"/>
+          <w:sz w:val="22"/>
+          <w:szCs w:val="22"/>
+        </w:rPr>
+        <w:t xml:space="preserve">frontend/src/pages/AsistentePublico.jsx — rediseño del banner de contacto para diferenciarlo visualmente de las burbujas del chat.</w:t>
+      </w:r>
+    </w:p>
+    <w:p>
+      <w:pPr>
+        <w:pStyle w:val="ListParagraph"/>
+        <w:numPr>
+          <w:ilvl w:val="0"/>
+          <w:numId w:val="2"/>
+        </w:numPr>
+        <w:spacing w:after="40" w:before="40" w:line="276"/>
+      </w:pPr>
+      <w:r>
+        <w:rPr>
+          <w:rFonts w:ascii="Arial" w:cs="Arial" w:eastAsia="Arial" w:hAnsi="Arial"/>
+          <w:color w:val="4A5568"/>
+          <w:sz w:val="22"/>
+          <w:szCs w:val="22"/>
+        </w:rPr>
+        <w:t xml:space="preserve">frontend/src/components/layout/AppShell.jsx — eliminado prefijo /api/v1 en authFetch de alertas; agregado ter-int-contactos al mapa SCREEN_TO_PATH.</w:t>
+      </w:r>
+    </w:p>
+    <w:p>
+      <w:pPr>
+        <w:pStyle w:val="ListParagraph"/>
+        <w:numPr>
+          <w:ilvl w:val="0"/>
+          <w:numId w:val="2"/>
+        </w:numPr>
+        <w:spacing w:after="40" w:before="40" w:line="276"/>
+      </w:pPr>
+      <w:r>
+        <w:rPr>
+          <w:rFonts w:ascii="Arial" w:cs="Arial" w:eastAsia="Arial" w:hAnsi="Arial"/>
+          <w:color w:val="4A5568"/>
+          <w:sz w:val="22"/>
+          <w:szCs w:val="22"/>
+        </w:rPr>
+        <w:t xml:space="preserve">docker-compose.yml — OLLAMA_MODEL cambiado de llama3.1:8b a qwen2.5:3b como default.</w:t>
+      </w:r>
+    </w:p>
+    <w:p>
+      <w:pPr>
+        <w:pStyle w:val="ListParagraph"/>
+        <w:numPr>
+          <w:ilvl w:val="0"/>
+          <w:numId w:val="2"/>
+        </w:numPr>
+        <w:spacing w:after="40" w:before="40" w:line="276"/>
+      </w:pPr>
+      <w:r>
+        <w:rPr>
+          <w:rFonts w:ascii="Arial" w:cs="Arial" w:eastAsia="Arial" w:hAnsi="Arial"/>
+          <w:color w:val="4A5568"/>
+          <w:sz w:val="22"/>
+          <w:szCs w:val="22"/>
+        </w:rPr>
+        <w:t xml:space="preserve">backend/app/api/ter_int_contactos_router.py — nuevo router con GET /ter-int/contactos, POST /atender y POST /no-atender. Registrado en main.py.</w:t>
+      </w:r>
+    </w:p>
+    <w:p>
+      <w:pPr>
+        <w:pStyle w:val="ListParagraph"/>
+        <w:numPr>
+          <w:ilvl w:val="0"/>
+          <w:numId w:val="2"/>
+        </w:numPr>
+        <w:spacing w:after="40" w:before="40" w:line="276"/>
+      </w:pPr>
+      <w:r>
+        <w:rPr>
+          <w:rFonts w:ascii="Arial" w:cs="Arial" w:eastAsia="Arial" w:hAnsi="Arial"/>
+          <w:color w:val="4A5568"/>
+          <w:sz w:val="22"/>
+          <w:szCs w:val="22"/>
+        </w:rPr>
+        <w:t xml:space="preserve">frontend/src/pages/terapeuta/interno/ContactosDerivados.jsx — nueva página con lista, filtros, expandible y modales de acción.</w:t>
+      </w:r>
+    </w:p>
+    <w:p>
+      <w:pPr>
+        <w:pStyle w:val="ListParagraph"/>
+        <w:numPr>
+          <w:ilvl w:val="0"/>
+          <w:numId w:val="2"/>
+        </w:numPr>
+        <w:spacing w:after="40" w:before="40" w:line="276"/>
+      </w:pPr>
+      <w:r>
+        <w:rPr>
+          <w:rFonts w:ascii="Arial" w:cs="Arial" w:eastAsia="Arial" w:hAnsi="Arial"/>
+          <w:color w:val="4A5568"/>
+          <w:sz w:val="22"/>
+          <w:szCs w:val="22"/>
+        </w:rPr>
+        <w:t xml:space="preserve">frontend/src/router/index.jsx — nueva ruta /terapeuta/interno/contactos.</w:t>
+      </w:r>
+    </w:p>
+    <w:p>
+      <w:pPr>
+        <w:pStyle w:val="ListParagraph"/>
+        <w:numPr>
+          <w:ilvl w:val="0"/>
+          <w:numId w:val="2"/>
+        </w:numPr>
+        <w:spacing w:after="40" w:before="40" w:line="276"/>
+      </w:pPr>
+      <w:r>
+        <w:rPr>
+          <w:rFonts w:ascii="Arial" w:cs="Arial" w:eastAsia="Arial" w:hAnsi="Arial"/>
+          <w:color w:val="4A5568"/>
+          <w:sz w:val="22"/>
+          <w:szCs w:val="22"/>
+        </w:rPr>
+        <w:t xml:space="preserve">backend/app/api/usuario_router.py — protección de único admin activo en PUT /usuarios/{id}.</w:t>
+      </w:r>
+    </w:p>
+    <w:p>
+      <w:pPr>
+        <w:pStyle w:val="ListParagraph"/>
+        <w:numPr>
+          <w:ilvl w:val="0"/>
+          <w:numId w:val="2"/>
+        </w:numPr>
+        <w:spacing w:after="40" w:before="40" w:line="276"/>
+      </w:pPr>
+      <w:r>
+        <w:rPr>
+          <w:rFonts w:ascii="Arial" w:cs="Arial" w:eastAsia="Arial" w:hAnsi="Arial"/>
+          <w:color w:val="4A5568"/>
+          <w:sz w:val="22"/>
+          <w:szCs w:val="22"/>
+        </w:rPr>
+        <w:t xml:space="preserve">backend/app/main.py — nav_config de ter-int actualizado con item “Contactos TEA”; router ter_int_contactos_router registrado.</w:t>
+      </w:r>
+    </w:p>
+    <w:p>
+      <w:pPr>
+        <w:pStyle w:val="Heading1"/>
+        <w:pageBreakBefore/>
+        <w:spacing w:after="120" w:before="360"/>
+      </w:pPr>
+      <w:r>
+        <w:rPr>
+          <w:rFonts w:ascii="Arial" w:cs="Arial" w:eastAsia="Arial" w:hAnsi="Arial"/>
+          <w:b/>
+          <w:bCs/>
+          <w:color w:val="0D6B6E"/>
+          <w:sz w:val="32"/>
+          <w:szCs w:val="32"/>
+        </w:rPr>
+        <w:t xml:space="preserve">15. Iteración 10 — Mejoras de UX, base de conocimiento admin y rediseño de login</w:t>
+      </w:r>
+    </w:p>
+    <w:p>
+      <w:pPr>
+        <w:spacing w:after="60" w:before="60" w:line="276"/>
+      </w:pPr>
+      <w:r>
+        <w:rPr>
+          <w:rFonts w:ascii="Arial" w:cs="Arial" w:eastAsia="Arial" w:hAnsi="Arial"/>
+          <w:color w:val="4A5568"/>
+          <w:sz w:val="22"/>
+          <w:szCs w:val="22"/>
+        </w:rPr>
+        <w:t xml:space="preserve">Esta iteración consolida mejoras de experiencia de usuario, corrige defectos de presentación detectados en producción y completa el ciclo de vida del familiar (alta desde el panel del terapeuta hasta el primer ingreso al sistema). Fecha: mayo 2026.</w:t>
+      </w:r>
+    </w:p>
+    <w:p>
+      <w:pPr>
+        <w:pStyle w:val="Heading2"/>
+        <w:spacing w:after="80" w:before="240"/>
+      </w:pPr>
+      <w:r>
+        <w:rPr>
+          <w:rFonts w:ascii="Arial" w:cs="Arial" w:eastAsia="Arial" w:hAnsi="Arial"/>
+          <w:b/>
+          <w:bCs/>
+          <w:color w:val="0D6B6E"/>
+          <w:sz w:val="26"/>
+          <w:szCs w:val="26"/>
+        </w:rPr>
+        <w:t xml:space="preserve">15.1 Rediseño de la pantalla de login</w:t>
+      </w:r>
+    </w:p>
+    <w:p>
+      <w:pPr>
+        <w:spacing w:after="60" w:before="60" w:line="276"/>
+      </w:pPr>
+      <w:r>
+        <w:rPr>
+          <w:rFonts w:ascii="Arial" w:cs="Arial" w:eastAsia="Arial" w:hAnsi="Arial"/>
+          <w:color w:val="4A5568"/>
+          <w:sz w:val="22"/>
+          <w:szCs w:val="22"/>
+        </w:rPr>
+        <w:t xml:space="preserve">La pantalla de login fue rediseñada para eliminar la necesidad de scroll vertical. La versión anterior concentraba logo, selector de rol, campos de email y contraseña, botón de ingreso, registro y el acceso al Asistente TEA en una única columna que superaba la altura del viewport en pantallas de laptop estándar.</w:t>
+      </w:r>
+    </w:p>
+    <w:p>
+      <w:pPr>
+        <w:spacing w:after="60" w:before="60" w:line="276"/>
+      </w:pPr>
+      <w:r>
+        <w:rPr>
+          <w:rFonts w:ascii="Arial" w:cs="Arial" w:eastAsia="Arial" w:hAnsi="Arial"/>
+          <w:color w:val="4A5568"/>
+          <w:sz w:val="22"/>
+          <w:szCs w:val="22"/>
+        </w:rPr>
+        <w:t xml:space="preserve">El nuevo diseño implementa un layout de dos paneles horizontales (max-width: 780px, min-height: 480px):</w:t>
+      </w:r>
+    </w:p>
+    <w:p>
+      <w:pPr>
+        <w:numPr>
+          <w:ilvl w:val="0"/>
+          <w:numId w:val="2"/>
+        </w:numPr>
+        <w:spacing w:after="40" w:before="40" w:line="276"/>
+      </w:pPr>
+      <w:r>
+        <w:rPr>
+          <w:rFonts w:ascii="Arial" w:cs="Arial" w:eastAsia="Arial" w:hAnsi="Arial"/>
+          <w:color w:val="4A5568"/>
+          <w:sz w:val="22"/>
+          <w:szCs w:val="22"/>
+        </w:rPr>
+        <w:t xml:space="preserve">Panel izquierdo (42%, fondo teal): logo, nombre de la plataforma, descripción y el botón “Consultar al Asistente TEA — sin registrarse”. El botón del asistente, que antes quedaba oculto al fondo del scroll, ahora está siempre visible.</w:t>
+      </w:r>
+    </w:p>
+    <w:p>
+      <w:pPr>
+        <w:numPr>
+          <w:ilvl w:val="0"/>
+          <w:numId w:val="2"/>
+        </w:numPr>
+        <w:spacing w:after="40" w:before="40" w:line="276"/>
+      </w:pPr>
+      <w:r>
+        <w:rPr>
+          <w:rFonts w:ascii="Arial" w:cs="Arial" w:eastAsia="Arial" w:hAnsi="Arial"/>
+          <w:color w:val="4A5568"/>
+          <w:sz w:val="22"/>
+          <w:szCs w:val="22"/>
+        </w:rPr>
+        <w:t xml:space="preserve">Panel derecho (58%, fondo blanco): título “Ingresá a tu cuenta”, selector de rol (4 botones en grilla 1×4), campo email, campo contraseña con toggle ver/ocultar, botón “Ingresar al sistema”, link de registro como familiar y nota de seguridad.</w:t>
+      </w:r>
+    </w:p>
+    <w:p>
+      <w:pPr>
+        <w:spacing w:after="60" w:before="60" w:line="276"/>
+      </w:pPr>
+      <w:r>
+        <w:rPr>
+          <w:rFonts w:ascii="Arial" w:cs="Arial" w:eastAsia="Arial" w:hAnsi="Arial"/>
+          <w:b/>
+          <w:bCs/>
+          <w:color w:val="4A5568"/>
+          <w:sz w:val="22"/>
+          <w:szCs w:val="22"/>
+        </w:rPr>
+        <w:t xml:space="preserve">Archivos modificados:</w:t>
+      </w:r>
+    </w:p>
+    <w:p>
+      <w:pPr>
+        <w:numPr>
+          <w:ilvl w:val="0"/>
+          <w:numId w:val="2"/>
+        </w:numPr>
+        <w:spacing w:after="40" w:before="40" w:line="276"/>
+      </w:pPr>
+      <w:r>
+        <w:rPr>
+          <w:rFonts w:ascii="Arial" w:cs="Arial" w:eastAsia="Arial" w:hAnsi="Arial"/>
+          <w:color w:val="4A5568"/>
+          <w:sz w:val="22"/>
+          <w:szCs w:val="22"/>
+        </w:rPr>
+        <w:t xml:space="preserve">frontend/src/pages/LoginPage.jsx — estructura reemplazada a layout de dos paneles; botón del asistente movido al panel izquierdo.</w:t>
+      </w:r>
+    </w:p>
+    <w:p>
+      <w:pPr>
+        <w:numPr>
+          <w:ilvl w:val="0"/>
+          <w:numId w:val="2"/>
+        </w:numPr>
+        <w:spacing w:after="40" w:before="40" w:line="276"/>
+      </w:pPr>
+      <w:r>
+        <w:rPr>
+          <w:rFonts w:ascii="Arial" w:cs="Arial" w:eastAsia="Arial" w:hAnsi="Arial"/>
+          <w:color w:val="4A5568"/>
+          <w:sz w:val="22"/>
+          <w:szCs w:val="22"/>
+        </w:rPr>
+        <w:t xml:space="preserve">frontend/src/styles/shell.css — .login-card redefinido como flex row; agregadas clases .login-left, .login-right, .login-assist-btn, .login-left-title, .login-right-title.</w:t>
+      </w:r>
+    </w:p>
+    <w:p>
+      <w:pPr>
+        <w:pStyle w:val="Heading2"/>
+        <w:spacing w:after="80" w:before="240"/>
+      </w:pPr>
+      <w:r>
+        <w:rPr>
+          <w:rFonts w:ascii="Arial" w:cs="Arial" w:eastAsia="Arial" w:hAnsi="Arial"/>
+          <w:b/>
+          <w:bCs/>
+          <w:color w:val="0D6B6E"/>
+          <w:sz w:val="26"/>
+          <w:szCs w:val="26"/>
+        </w:rPr>
+        <w:t xml:space="preserve">15.2 Panel de administración de la base de conocimiento</w:t>
+      </w:r>
+    </w:p>
+    <w:p>
+      <w:pPr>
+        <w:spacing w:after="60" w:before="60" w:line="276"/>
+      </w:pPr>
+      <w:r>
+        <w:rPr>
+          <w:rFonts w:ascii="Arial" w:cs="Arial" w:eastAsia="Arial" w:hAnsi="Arial"/>
+          <w:color w:val="4A5568"/>
+          <w:sz w:val="22"/>
+          <w:szCs w:val="22"/>
+        </w:rPr>
+        <w:t xml:space="preserve">Se implementó la página de administración de recursos bibliográficos para el rol admin. Anteriormente el admin no tenía ninguna pantalla desde la que pudiera ver, validar ni eliminar los recursos subidos por los terapeutas. El componente AdminRecursos (Recursos.jsx) provee las siguientes capacidades:</w:t>
+      </w:r>
+    </w:p>
+    <w:p>
+      <w:pPr>
+        <w:numPr>
+          <w:ilvl w:val="0"/>
+          <w:numId w:val="2"/>
+        </w:numPr>
+        <w:spacing w:after="40" w:before="40" w:line="276"/>
+      </w:pPr>
+      <w:r>
+        <w:rPr>
+          <w:rFonts w:ascii="Arial" w:cs="Arial" w:eastAsia="Arial" w:hAnsi="Arial"/>
+          <w:color w:val="4A5568"/>
+          <w:sz w:val="22"/>
+          <w:szCs w:val="22"/>
+        </w:rPr>
+        <w:t xml:space="preserve">Listado completo de recursos (validados y pendientes) con filtros por estado y búsqueda por título/descripción.</w:t>
+      </w:r>
+    </w:p>
+    <w:p>
+      <w:pPr>
+        <w:numPr>
+          <w:ilvl w:val="0"/>
+          <w:numId w:val="2"/>
+        </w:numPr>
+        <w:spacing w:after="40" w:before="40" w:line="276"/>
+      </w:pPr>
+      <w:r>
+        <w:rPr>
+          <w:rFonts w:ascii="Arial" w:cs="Arial" w:eastAsia="Arial" w:hAnsi="Arial"/>
+          <w:color w:val="4A5568"/>
+          <w:sz w:val="22"/>
+          <w:szCs w:val="22"/>
+        </w:rPr>
+        <w:t xml:space="preserve">Botón “✓ Validar” para aprobar recursos pendientes. La validación llama a POST /recursos/{id}/validar, que marca el recurso como validado=True y encola en background la generación del embedding RAG.</w:t>
+      </w:r>
+    </w:p>
+    <w:p>
+      <w:pPr>
+        <w:numPr>
+          <w:ilvl w:val="0"/>
+          <w:numId w:val="2"/>
+        </w:numPr>
+        <w:spacing w:after="40" w:before="40" w:line="276"/>
+      </w:pPr>
+      <w:r>
+        <w:rPr>
+          <w:rFonts w:ascii="Arial" w:cs="Arial" w:eastAsia="Arial" w:hAnsi="Arial"/>
+          <w:color w:val="4A5568"/>
+          <w:sz w:val="22"/>
+          <w:szCs w:val="22"/>
+        </w:rPr>
+        <w:t xml:space="preserve">Soft delete de recursos via DELETE /recursos/{id} (activo=False).</w:t>
+      </w:r>
+    </w:p>
+    <w:p>
+      <w:pPr>
+        <w:numPr>
+          <w:ilvl w:val="0"/>
+          <w:numId w:val="2"/>
+        </w:numPr>
+        <w:spacing w:after="40" w:before="40" w:line="276"/>
+      </w:pPr>
+      <w:r>
+        <w:rPr>
+          <w:rFonts w:ascii="Arial" w:cs="Arial" w:eastAsia="Arial" w:hAnsi="Arial"/>
+          <w:color w:val="4A5568"/>
+          <w:sz w:val="22"/>
+          <w:szCs w:val="22"/>
+        </w:rPr>
+        <w:t xml:space="preserve">Carga de nuevos recursos directamente desde el panel admin (modal con campos título, tipo, descripción, contenido de texto para RAG y URL opcional).</w:t>
+      </w:r>
+    </w:p>
+    <w:p>
+      <w:pPr>
+        <w:numPr>
+          <w:ilvl w:val="0"/>
+          <w:numId w:val="2"/>
+        </w:numPr>
+        <w:spacing w:after="40" w:before="40" w:line="276"/>
+      </w:pPr>
+      <w:r>
+        <w:rPr>
+          <w:rFonts w:ascii="Arial" w:cs="Arial" w:eastAsia="Arial" w:hAnsi="Arial"/>
+          <w:color w:val="4A5568"/>
+          <w:sz w:val="22"/>
+          <w:szCs w:val="22"/>
+        </w:rPr>
+        <w:t xml:space="preserve">Estado vacío informativo: distingue entre “sin recursos en la BD” (con botón para agregar el primero) y “sin resultados con el filtro activo”. Mensaje de error persistente si el API falla, con botón de reintento.</w:t>
+      </w:r>
+    </w:p>
+    <w:p>
+      <w:pPr>
+        <w:spacing w:after="60" w:before="60" w:line="276"/>
+      </w:pPr>
+      <w:r>
+        <w:rPr>
+          <w:rFonts w:ascii="Arial" w:cs="Arial" w:eastAsia="Arial" w:hAnsi="Arial"/>
+          <w:color w:val="4A5568"/>
+          <w:sz w:val="22"/>
+          <w:szCs w:val="22"/>
+        </w:rPr>
+        <w:t xml:space="preserve">El ítem “Base de conocimiento” fue agregado al nav_config del rol admin en backend/app/main.py (id: “admin-recursos”, icon: “book”). El backend actualiza automáticamente la BD al reiniciarse. La ruta es /admin/recursos.</w:t>
+      </w:r>
+    </w:p>
+    <w:p>
+      <w:pPr>
+        <w:spacing w:after="60" w:before="60" w:line="276"/>
+      </w:pPr>
+      <w:r>
+        <w:rPr>
+          <w:rFonts w:ascii="Arial" w:cs="Arial" w:eastAsia="Arial" w:hAnsi="Arial"/>
+          <w:b/>
+          <w:bCs/>
+          <w:color w:val="4A5568"/>
+          <w:sz w:val="22"/>
+          <w:szCs w:val="22"/>
+        </w:rPr>
+        <w:t xml:space="preserve">Archivos modificados:</w:t>
+      </w:r>
+    </w:p>
+    <w:p>
+      <w:pPr>
+        <w:numPr>
+          <w:ilvl w:val="0"/>
+          <w:numId w:val="2"/>
+        </w:numPr>
+        <w:spacing w:after="40" w:before="40" w:line="276"/>
+      </w:pPr>
+      <w:r>
+        <w:rPr>
+          <w:rFonts w:ascii="Arial" w:cs="Arial" w:eastAsia="Arial" w:hAnsi="Arial"/>
+          <w:color w:val="4A5568"/>
+          <w:sz w:val="22"/>
+          <w:szCs w:val="22"/>
+        </w:rPr>
+        <w:t xml:space="preserve">frontend/src/pages/admin/Recursos.jsx — nuevo componente AdminRecursos con listado, filtros, validación, eliminación y carga de recursos.</w:t>
+      </w:r>
+    </w:p>
+    <w:p>
+      <w:pPr>
+        <w:numPr>
+          <w:ilvl w:val="0"/>
+          <w:numId w:val="2"/>
+        </w:numPr>
+        <w:spacing w:after="40" w:before="40" w:line="276"/>
+      </w:pPr>
+      <w:r>
+        <w:rPr>
+          <w:rFonts w:ascii="Arial" w:cs="Arial" w:eastAsia="Arial" w:hAnsi="Arial"/>
+          <w:color w:val="4A5568"/>
+          <w:sz w:val="22"/>
+          <w:szCs w:val="22"/>
+        </w:rPr>
+        <w:t xml:space="preserve">frontend/src/router/index.jsx — ruta /admin/recursos agregada; import de AdminRecursos incorporado.</w:t>
+      </w:r>
+    </w:p>
+    <w:p>
+      <w:pPr>
+        <w:numPr>
+          <w:ilvl w:val="0"/>
+          <w:numId w:val="2"/>
+        </w:numPr>
+        <w:spacing w:after="40" w:before="40" w:line="276"/>
+      </w:pPr>
+      <w:r>
+        <w:rPr>
+          <w:rFonts w:ascii="Arial" w:cs="Arial" w:eastAsia="Arial" w:hAnsi="Arial"/>
+          <w:color w:val="4A5568"/>
+          <w:sz w:val="22"/>
+          <w:szCs w:val="22"/>
+        </w:rPr>
+        <w:t xml:space="preserve">frontend/src/components/layout/AppShell.jsx — agregado ‘admin-recursos’: ‘/admin/recursos’ en SCREEN_TO_PATH.</w:t>
+      </w:r>
+    </w:p>
+    <w:p>
+      <w:pPr>
+        <w:numPr>
+          <w:ilvl w:val="0"/>
+          <w:numId w:val="2"/>
+        </w:numPr>
+        <w:spacing w:after="40" w:before="40" w:line="276"/>
+      </w:pPr>
+      <w:r>
+        <w:rPr>
+          <w:rFonts w:ascii="Arial" w:cs="Arial" w:eastAsia="Arial" w:hAnsi="Arial"/>
+          <w:color w:val="4A5568"/>
+          <w:sz w:val="22"/>
+          <w:szCs w:val="22"/>
+        </w:rPr>
+        <w:t xml:space="preserve">backend/app/main.py — nav_config del rol admin actualizado con item {“id”: “admin-recursos”, “icon”: “book”, “label”: “Base de conocimiento”}.</w:t>
+      </w:r>
+    </w:p>
+    <w:p>
+      <w:pPr>
+        <w:pStyle w:val="Heading2"/>
+        <w:spacing w:after="80" w:before="240"/>
+      </w:pPr>
+      <w:r>
+        <w:rPr>
+          <w:rFonts w:ascii="Arial" w:cs="Arial" w:eastAsia="Arial" w:hAnsi="Arial"/>
+          <w:b/>
+          <w:bCs/>
+          <w:color w:val="0D6B6E"/>
+          <w:sz w:val="26"/>
+          <w:szCs w:val="26"/>
+        </w:rPr>
+        <w:t xml:space="preserve">15.3 Flujo de contraseña temporal para el familiar dado de alta por el terapeuta</w:t>
+      </w:r>
+    </w:p>
+    <w:p>
+      <w:pPr>
+        <w:spacing w:after="60" w:before="60" w:line="276"/>
+      </w:pPr>
+      <w:r>
+        <w:rPr>
+          <w:rFonts w:ascii="Arial" w:cs="Arial" w:eastAsia="Arial" w:hAnsi="Arial"/>
+          <w:color w:val="4A5568"/>
+          <w:sz w:val="22"/>
+          <w:szCs w:val="22"/>
+        </w:rPr>
+        <w:t xml:space="preserve">Cuando el terapeuta interno acepta un contacto TEA mediante el botón “Atender” en ContactosDerivados.jsx, el backend crea el usuario Familiar con activo=True y genera una contraseña temporal segura. El ciclo completo implementado es el siguiente:</w:t>
+      </w:r>
+    </w:p>
+    <w:p>
+      <w:pPr>
+        <w:numPr>
+          <w:ilvl w:val="0"/>
+          <w:numId w:val="2"/>
+        </w:numPr>
+        <w:spacing w:after="40" w:before="40" w:line="276"/>
+      </w:pPr>
+      <w:r>
+        <w:rPr>
+          <w:rFonts w:ascii="Arial" w:cs="Arial" w:eastAsia="Arial" w:hAnsi="Arial"/>
+          <w:color w:val="4A5568"/>
+          <w:sz w:val="22"/>
+          <w:szCs w:val="22"/>
+        </w:rPr>
+        <w:t xml:space="preserve">Backend (ter_int_contactos_router.py): genera contraseña temporal con secrets.token_hex(3) en el formato “AccXXXXXX1!” (10 caracteres, cumple requisitos de seguridad). Crea el usuario con activo=True y debe_cambiar_password=True. Devuelve password_temporal, nombre_familiar y email_familiar en la respuesta.</w:t>
+      </w:r>
+    </w:p>
+    <w:p>
+      <w:pPr>
+        <w:numPr>
+          <w:ilvl w:val="0"/>
+          <w:numId w:val="2"/>
+        </w:numPr>
+        <w:spacing w:after="40" w:before="40" w:line="276"/>
+      </w:pPr>
+      <w:r>
+        <w:rPr>
+          <w:rFonts w:ascii="Arial" w:cs="Arial" w:eastAsia="Arial" w:hAnsi="Arial"/>
+          <w:color w:val="4A5568"/>
+          <w:sz w:val="22"/>
+          <w:szCs w:val="22"/>
+        </w:rPr>
+        <w:t xml:space="preserve">Frontend (ContactosDerivados.jsx): al recibir password_temporal en la respuesta, muestra un modal “Simulación de envío de email” con los datos de acceso (nombre, email, contraseña con botón de copia). El terapeuta puede compartirlos con el familiar.</w:t>
+      </w:r>
+    </w:p>
+    <w:p>
+      <w:pPr>
+        <w:numPr>
+          <w:ilvl w:val="0"/>
+          <w:numId w:val="2"/>
+        </w:numPr>
+        <w:spacing w:after="40" w:before="40" w:line="276"/>
+      </w:pPr>
+      <w:r>
+        <w:rPr>
+          <w:rFonts w:ascii="Arial" w:cs="Arial" w:eastAsia="Arial" w:hAnsi="Arial"/>
+          <w:color w:val="4A5568"/>
+          <w:sz w:val="22"/>
+          <w:szCs w:val="22"/>
+        </w:rPr>
+        <w:t xml:space="preserve">Primer ingreso (AppShell.jsx): si user.debe_cambiar_password === true, se abre automáticamente el modal de cambio de contraseña, sin posibilidad de cerrarlo. Una vez cambiada exitosamente, updateUser({ debe_cambiar_password: false }) actualiza el estado y localStorage, y el modal se cierra tras 1,8 segundos.</w:t>
+      </w:r>
+    </w:p>
+    <w:p>
+      <w:pPr>
+        <w:numPr>
+          <w:ilvl w:val="0"/>
+          <w:numId w:val="2"/>
+        </w:numPr>
+        <w:spacing w:after="40" w:before="40" w:line="276"/>
+      </w:pPr>
+      <w:r>
+        <w:rPr>
+          <w:rFonts w:ascii="Arial" w:cs="Arial" w:eastAsia="Arial" w:hAnsi="Arial"/>
+          <w:color w:val="4A5568"/>
+          <w:sz w:val="22"/>
+          <w:szCs w:val="22"/>
+        </w:rPr>
+        <w:t xml:space="preserve">La columna debe_cambiar_password (BOOLEAN NOT NULL DEFAULT FALSE) se agregó al modelo Usuario. Requiere migración SQL en producción: ALTER TABLE usuarios ADD COLUMN IF NOT EXISTS debe_cambiar_password BOOLEAN NOT NULL DEFAULT FALSE;</w:t>
+      </w:r>
+    </w:p>
+    <w:p>
+      <w:pPr>
+        <w:spacing w:after="60" w:before="60" w:line="276"/>
+      </w:pPr>
+      <w:r>
+        <w:rPr>
+          <w:rFonts w:ascii="Arial" w:cs="Arial" w:eastAsia="Arial" w:hAnsi="Arial"/>
+          <w:b/>
+          <w:bCs/>
+          <w:color w:val="4A5568"/>
+          <w:sz w:val="22"/>
+          <w:szCs w:val="22"/>
+        </w:rPr>
+        <w:t xml:space="preserve">Archivos modificados:</w:t>
+      </w:r>
+    </w:p>
+    <w:p>
+      <w:pPr>
+        <w:numPr>
+          <w:ilvl w:val="0"/>
+          <w:numId w:val="2"/>
+        </w:numPr>
+        <w:spacing w:after="40" w:before="40" w:line="276"/>
+      </w:pPr>
+      <w:r>
+        <w:rPr>
+          <w:rFonts w:ascii="Arial" w:cs="Arial" w:eastAsia="Arial" w:hAnsi="Arial"/>
+          <w:color w:val="4A5568"/>
+          <w:sz w:val="22"/>
+          <w:szCs w:val="22"/>
+        </w:rPr>
+        <w:t xml:space="preserve">backend/app/models/usuario.py — columna debe_cambiar_password agregada.</w:t>
+      </w:r>
+    </w:p>
+    <w:p>
+      <w:pPr>
+        <w:numPr>
+          <w:ilvl w:val="0"/>
+          <w:numId w:val="2"/>
+        </w:numPr>
+        <w:spacing w:after="40" w:before="40" w:line="276"/>
+      </w:pPr>
+      <w:r>
+        <w:rPr>
+          <w:rFonts w:ascii="Arial" w:cs="Arial" w:eastAsia="Arial" w:hAnsi="Arial"/>
+          <w:color w:val="4A5568"/>
+          <w:sz w:val="22"/>
+          <w:szCs w:val="22"/>
+        </w:rPr>
+        <w:t xml:space="preserve">backend/app/api/auth_router.py — campo debe_cambiar_password incluido en la respuesta del endpoint /auth/login.</w:t>
+      </w:r>
+    </w:p>
+    <w:p>
+      <w:pPr>
+        <w:numPr>
+          <w:ilvl w:val="0"/>
+          <w:numId w:val="2"/>
+        </w:numPr>
+        <w:spacing w:after="40" w:before="40" w:line="276"/>
+      </w:pPr>
+      <w:r>
+        <w:rPr>
+          <w:rFonts w:ascii="Arial" w:cs="Arial" w:eastAsia="Arial" w:hAnsi="Arial"/>
+          <w:color w:val="4A5568"/>
+          <w:sz w:val="22"/>
+          <w:szCs w:val="22"/>
+        </w:rPr>
+        <w:t xml:space="preserve">backend/app/api/ter_int_contactos_router.py — contraseña temporal generada con secrets; activo=True; debe_cambiar_password=True; respuesta ampliada con password_temporal, nombre_familiar, email_familiar.</w:t>
+      </w:r>
+    </w:p>
+    <w:p>
+      <w:pPr>
+        <w:numPr>
+          <w:ilvl w:val="0"/>
+          <w:numId w:val="2"/>
+        </w:numPr>
+        <w:spacing w:after="40" w:before="40" w:line="276"/>
+      </w:pPr>
+      <w:r>
+        <w:rPr>
+          <w:rFonts w:ascii="Arial" w:cs="Arial" w:eastAsia="Arial" w:hAnsi="Arial"/>
+          <w:color w:val="4A5568"/>
+          <w:sz w:val="22"/>
+          <w:szCs w:val="22"/>
+        </w:rPr>
+        <w:t xml:space="preserve">backend/app/api/usuario_router.py — al cambiar contraseña exitosamente, limpia debe_cambiar_password=False.</w:t>
+      </w:r>
+    </w:p>
+    <w:p>
+      <w:pPr>
+        <w:numPr>
+          <w:ilvl w:val="0"/>
+          <w:numId w:val="2"/>
+        </w:numPr>
+        <w:spacing w:after="40" w:before="40" w:line="276"/>
+      </w:pPr>
+      <w:r>
+        <w:rPr>
+          <w:rFonts w:ascii="Arial" w:cs="Arial" w:eastAsia="Arial" w:hAnsi="Arial"/>
+          <w:color w:val="4A5568"/>
+          <w:sz w:val="22"/>
+          <w:szCs w:val="22"/>
+        </w:rPr>
+        <w:t xml:space="preserve">frontend/src/pages/terapeuta/interno/ContactosDerivados.jsx — componente ModalEmailSimulado con datos de acceso y botón de copia; estado emailModal en ContactoCard.</w:t>
+      </w:r>
+    </w:p>
+    <w:p>
+      <w:pPr>
+        <w:numPr>
+          <w:ilvl w:val="0"/>
+          <w:numId w:val="2"/>
+        </w:numPr>
+        <w:spacing w:after="40" w:before="40" w:line="276"/>
+      </w:pPr>
+      <w:r>
+        <w:rPr>
+          <w:rFonts w:ascii="Arial" w:cs="Arial" w:eastAsia="Arial" w:hAnsi="Arial"/>
+          <w:color w:val="4A5568"/>
+          <w:sz w:val="22"/>
+          <w:szCs w:val="22"/>
+        </w:rPr>
+        <w:t xml:space="preserve">frontend/src/components/layout/AppShell.jsx — estado forzarCambio; useEffect que detecta debe_cambiar_password al montar; modal bloqueado (sin X, sin click fuera) cuando es forzado.</w:t>
+      </w:r>
+    </w:p>
+    <w:p>
+      <w:pPr>
+        <w:numPr>
+          <w:ilvl w:val="0"/>
+          <w:numId w:val="2"/>
+        </w:numPr>
+        <w:spacing w:after="40" w:before="40" w:line="276"/>
+      </w:pPr>
+      <w:r>
+        <w:rPr>
+          <w:rFonts w:ascii="Arial" w:cs="Arial" w:eastAsia="Arial" w:hAnsi="Arial"/>
+          <w:color w:val="4A5568"/>
+          <w:sz w:val="22"/>
+          <w:szCs w:val="22"/>
+        </w:rPr>
+        <w:t xml:space="preserve">frontend/src/context/AuthContext.jsx — función updateUser agregada al contexto para actualizar campos parciales del usuario en estado y localStorage.</w:t>
+      </w:r>
+    </w:p>
+    <w:p>
+      <w:pPr>
+        <w:pStyle w:val="Heading2"/>
+        <w:spacing w:after="80" w:before="240"/>
+      </w:pPr>
+      <w:r>
+        <w:rPr>
+          <w:rFonts w:ascii="Arial" w:cs="Arial" w:eastAsia="Arial" w:hAnsi="Arial"/>
+          <w:b/>
+          <w:bCs/>
+          <w:color w:val="0D6B6E"/>
+          <w:sz w:val="26"/>
+          <w:szCs w:val="26"/>
+        </w:rPr>
+        <w:t xml:space="preserve">15.4 Correcciones de UX en la base de conocimiento del terapeuta interno</w:t>
+      </w:r>
+    </w:p>
+    <w:p>
+      <w:pPr>
+        <w:spacing w:after="60" w:before="60" w:line="276"/>
+      </w:pPr>
+      <w:r>
+        <w:rPr>
+          <w:rFonts w:ascii="Arial" w:cs="Arial" w:eastAsia="Arial" w:hAnsi="Arial"/>
+          <w:color w:val="4A5568"/>
+          <w:sz w:val="22"/>
+          <w:szCs w:val="22"/>
+        </w:rPr>
+        <w:t xml:space="preserve">Se identificaron y corrigieron dos defectos de presentación en la página Conocimiento.jsx del terapeuta interno:</w:t>
+      </w:r>
+    </w:p>
+    <w:p>
+      <w:pPr>
+        <w:numPr>
+          <w:ilvl w:val="0"/>
+          <w:numId w:val="2"/>
+        </w:numPr>
+        <w:spacing w:after="40" w:before="40" w:line="276"/>
+      </w:pPr>
+      <w:r>
+        <w:rPr>
+          <w:rFonts w:ascii="Arial" w:cs="Arial" w:eastAsia="Arial" w:hAnsi="Arial"/>
+          <w:color w:val="4A5568"/>
+          <w:sz w:val="22"/>
+          <w:szCs w:val="22"/>
+        </w:rPr>
+        <w:t xml:space="preserve">Duplicación de recursos validados: existía una sección “Recursos validados” con tarjetas de color ámbar en la parte superior de la página, que mostraba los mismos recursos que aparecían en la lista completa debajo. Se eliminó el bloque duplicado (líneas 362–397 del componente original). Ahora sólo existe la lista unificada con ícono de libro, igual al panel del admin.</w:t>
+      </w:r>
+    </w:p>
+    <w:p>
+      <w:pPr>
+        <w:numPr>
+          <w:ilvl w:val="0"/>
+          <w:numId w:val="2"/>
+        </w:numPr>
+        <w:spacing w:after="40" w:before="40" w:line="276"/>
+      </w:pPr>
+      <w:r>
+        <w:rPr>
+          <w:rFonts w:ascii="Arial" w:cs="Arial" w:eastAsia="Arial" w:hAnsi="Arial"/>
+          <w:color w:val="4A5568"/>
+          <w:sz w:val="22"/>
+          <w:szCs w:val="22"/>
+        </w:rPr>
+        <w:t xml:space="preserve">Estrella ausente en tarjetas individuales: la estrella (★) que indica que un recurso está validado aparecía en el encabezado de la sección pero no en cada tarjeta. Se agregó el ícono IcoStar junto al título de cada recurso validado en la lista. Se incorporó además borde lateral de color (teal para validados, ámbar para pendientes) para distinguir visualmente el estado de cada recurso.</w:t>
+      </w:r>
+    </w:p>
+    <w:p>
+      <w:pPr>
+        <w:spacing w:after="60" w:before="60" w:line="276"/>
+      </w:pPr>
+      <w:r>
+        <w:rPr>
+          <w:rFonts w:ascii="Arial" w:cs="Arial" w:eastAsia="Arial" w:hAnsi="Arial"/>
+          <w:b/>
+          <w:bCs/>
+          <w:color w:val="4A5568"/>
+          <w:sz w:val="22"/>
+          <w:szCs w:val="22"/>
+        </w:rPr>
+        <w:t xml:space="preserve">Archivos modificados:</w:t>
+      </w:r>
+    </w:p>
+    <w:p>
+      <w:pPr>
+        <w:numPr>
+          <w:ilvl w:val="0"/>
+          <w:numId w:val="2"/>
+        </w:numPr>
+        <w:spacing w:after="40" w:before="40" w:line="276"/>
+      </w:pPr>
+      <w:r>
+        <w:rPr>
+          <w:rFonts w:ascii="Arial" w:cs="Arial" w:eastAsia="Arial" w:hAnsi="Arial"/>
+          <w:color w:val="4A5568"/>
+          <w:sz w:val="22"/>
+          <w:szCs w:val="22"/>
+        </w:rPr>
+        <w:t xml:space="preserve">frontend/src/pages/terapeuta/interno/Conocimiento.jsx — eliminada sección “Destacados” (tarjetas ámbar duplicadas); borde lateral teal/amber en cada card de la lista unificada.</w:t>
+      </w:r>
+    </w:p>
+    <w:p>
+      <w:pPr>
+        <w:pStyle w:val="Heading2"/>
+        <w:spacing w:after="80" w:before="240"/>
+      </w:pPr>
+      <w:r>
+        <w:rPr>
+          <w:rFonts w:ascii="Arial" w:cs="Arial" w:eastAsia="Arial" w:hAnsi="Arial"/>
+          <w:b/>
+          <w:bCs/>
+          <w:color w:val="0D6B6E"/>
+          <w:sz w:val="26"/>
+          <w:szCs w:val="26"/>
+        </w:rPr>
+        <w:t xml:space="preserve">15.5 Diagnóstico del asistente IA: logging de errores en el pipeline RAG</w:t>
+      </w:r>
+    </w:p>
+    <w:p>
+      <w:pPr>
+        <w:spacing w:after="60" w:before="60" w:line="276"/>
+      </w:pPr>
+      <w:r>
+        <w:rPr>
+          <w:rFonts w:ascii="Arial" w:cs="Arial" w:eastAsia="Arial" w:hAnsi="Arial"/>
+          <w:color w:val="4A5568"/>
+          <w:sz w:val="22"/>
+          <w:szCs w:val="22"/>
+        </w:rPr>
+        <w:t xml:space="preserve">Se detectó que los endpoints /ia/chat-publico y /ia/chat-familiar tenían bloques except Exception: pass que silenciaban cualquier error en el pipeline RAG. Esto impedía diagnosticar por qué el asistente respondía con el mensaje de fallback “modo básico”. Se reemplazaron por:</w:t>
+      </w:r>
+    </w:p>
+    <w:p>
+      <w:pPr>
+        <w:numPr>
+          <w:ilvl w:val="0"/>
+          <w:numId w:val="2"/>
+        </w:numPr>
+        <w:spacing w:after="40" w:before="40" w:line="276"/>
+      </w:pPr>
+      <w:r>
+        <w:rPr>
+          <w:rFonts w:ascii="Arial" w:cs="Arial" w:eastAsia="Arial" w:hAnsi="Arial"/>
+          <w:color w:val="4A5568"/>
+          <w:sz w:val="22"/>
+          <w:szCs w:val="22"/>
+        </w:rPr>
+        <w:t xml:space="preserve">except Exception as exc: logging.error(“[chat-publico] Error en pipeline IA: %s\n%s”, exc, traceback.format_exc()) — permite ver el error real en los logs de Docker (docker compose logs backend --follow).</w:t>
+      </w:r>
+    </w:p>
+    <w:p>
+      <w:pPr>
+        <w:spacing w:after="60" w:before="60" w:line="276"/>
+      </w:pPr>
+      <w:r>
+        <w:rPr>
+          <w:rFonts w:ascii="Arial" w:cs="Arial" w:eastAsia="Arial" w:hAnsi="Arial"/>
+          <w:b/>
+          <w:bCs/>
+          <w:color w:val="4A5568"/>
+          <w:sz w:val="22"/>
+          <w:szCs w:val="22"/>
+        </w:rPr>
+        <w:t xml:space="preserve">Archivos modificados:</w:t>
+      </w:r>
+    </w:p>
+    <w:p>
+      <w:pPr>
+        <w:numPr>
+          <w:ilvl w:val="0"/>
+          <w:numId w:val="2"/>
+        </w:numPr>
+        <w:spacing w:after="40" w:before="40" w:line="276"/>
+      </w:pPr>
+      <w:r>
+        <w:rPr>
+          <w:rFonts w:ascii="Arial" w:cs="Arial" w:eastAsia="Arial" w:hAnsi="Arial"/>
+          <w:color w:val="4A5568"/>
+          <w:sz w:val="22"/>
+          <w:szCs w:val="22"/>
+        </w:rPr>
+        <w:t xml:space="preserve">backend/app/api/sesion_ia_router.py — except Exception: pass reemplazado por logging.error + traceback en ambos endpoints de chat.</w:t>
+      </w:r>
+    </w:p>
+    <w:p>
+      <w:pPr>
+        <w:pStyle w:val="Heading2"/>
+        <w:spacing w:after="80" w:before="240"/>
+      </w:pPr>
+      <w:r>
+        <w:rPr>
+          <w:rFonts w:ascii="Arial" w:cs="Arial" w:eastAsia="Arial" w:hAnsi="Arial"/>
+          <w:b/>
+          <w:bCs/>
+          <w:color w:val="0D6B6E"/>
+          <w:sz w:val="26"/>
+          <w:szCs w:val="26"/>
+        </w:rPr>
+        <w:t xml:space="preserve">15.6 Archivos modificados en esta iteración</w:t>
+      </w:r>
+    </w:p>
+    <w:p>
+      <w:pPr>
+        <w:numPr>
+          <w:ilvl w:val="0"/>
+          <w:numId w:val="2"/>
+        </w:numPr>
+        <w:spacing w:after="40" w:before="40" w:line="276"/>
+      </w:pPr>
+      <w:r>
+        <w:rPr>
+          <w:rFonts w:ascii="Arial" w:cs="Arial" w:eastAsia="Arial" w:hAnsi="Arial"/>
+          <w:color w:val="4A5568"/>
+          <w:sz w:val="22"/>
+          <w:szCs w:val="22"/>
+        </w:rPr>
+        <w:t xml:space="preserve">frontend/src/pages/LoginPage.jsx — rediseño completo a layout de dos paneles.</w:t>
+      </w:r>
+    </w:p>
+    <w:p>
+      <w:pPr>
+        <w:numPr>
+          <w:ilvl w:val="0"/>
+          <w:numId w:val="2"/>
+        </w:numPr>
+        <w:spacing w:after="40" w:before="40" w:line="276"/>
+      </w:pPr>
+      <w:r>
+        <w:rPr>
+          <w:rFonts w:ascii="Arial" w:cs="Arial" w:eastAsia="Arial" w:hAnsi="Arial"/>
+          <w:color w:val="4A5568"/>
+          <w:sz w:val="22"/>
+          <w:szCs w:val="22"/>
+        </w:rPr>
+        <w:t xml:space="preserve">frontend/src/styles/shell.css — nuevas clases para layout de login de dos paneles.</w:t>
+      </w:r>
+    </w:p>
+    <w:p>
+      <w:pPr>
+        <w:numPr>
+          <w:ilvl w:val="0"/>
+          <w:numId w:val="2"/>
+        </w:numPr>
+        <w:spacing w:after="40" w:before="40" w:line="276"/>
+      </w:pPr>
+      <w:r>
+        <w:rPr>
+          <w:rFonts w:ascii="Arial" w:cs="Arial" w:eastAsia="Arial" w:hAnsi="Arial"/>
+          <w:color w:val="4A5568"/>
+          <w:sz w:val="22"/>
+          <w:szCs w:val="22"/>
+        </w:rPr>
+        <w:t xml:space="preserve">frontend/src/pages/admin/Recursos.jsx — nueva página de administración de la base de conocimiento.</w:t>
+      </w:r>
+    </w:p>
+    <w:p>
+      <w:pPr>
+        <w:numPr>
+          <w:ilvl w:val="0"/>
+          <w:numId w:val="2"/>
+        </w:numPr>
+        <w:spacing w:after="40" w:before="40" w:line="276"/>
+      </w:pPr>
+      <w:r>
+        <w:rPr>
+          <w:rFonts w:ascii="Arial" w:cs="Arial" w:eastAsia="Arial" w:hAnsi="Arial"/>
+          <w:color w:val="4A5568"/>
+          <w:sz w:val="22"/>
+          <w:szCs w:val="22"/>
+        </w:rPr>
+        <w:t xml:space="preserve">frontend/src/router/index.jsx — ruta /admin/recursos y import AdminRecursos.</w:t>
+      </w:r>
+    </w:p>
+    <w:p>
+      <w:pPr>
+        <w:numPr>
+          <w:ilvl w:val="0"/>
+          <w:numId w:val="2"/>
+        </w:numPr>
+        <w:spacing w:after="40" w:before="40" w:line="276"/>
+      </w:pPr>
+      <w:r>
+        <w:rPr>
+          <w:rFonts w:ascii="Arial" w:cs="Arial" w:eastAsia="Arial" w:hAnsi="Arial"/>
+          <w:color w:val="4A5568"/>
+          <w:sz w:val="22"/>
+          <w:szCs w:val="22"/>
+        </w:rPr>
+        <w:t xml:space="preserve">frontend/src/components/layout/AppShell.jsx — SCREEN_TO_PATH actualizado; forzarCambio y useEffect para primer ingreso; updateUser integrado.</w:t>
+      </w:r>
+    </w:p>
+    <w:p>
+      <w:pPr>
+        <w:numPr>
+          <w:ilvl w:val="0"/>
+          <w:numId w:val="2"/>
+        </w:numPr>
+        <w:spacing w:after="40" w:before="40" w:line="276"/>
+      </w:pPr>
+      <w:r>
+        <w:rPr>
+          <w:rFonts w:ascii="Arial" w:cs="Arial" w:eastAsia="Arial" w:hAnsi="Arial"/>
+          <w:color w:val="4A5568"/>
+          <w:sz w:val="22"/>
+          <w:szCs w:val="22"/>
+        </w:rPr>
+        <w:t xml:space="preserve">frontend/src/context/AuthContext.jsx — función updateUser expuesta en el contexto.</w:t>
+      </w:r>
+    </w:p>
+    <w:p>
+      <w:pPr>
+        <w:numPr>
+          <w:ilvl w:val="0"/>
+          <w:numId w:val="2"/>
+        </w:numPr>
+        <w:spacing w:after="40" w:before="40" w:line="276"/>
+      </w:pPr>
+      <w:r>
+        <w:rPr>
+          <w:rFonts w:ascii="Arial" w:cs="Arial" w:eastAsia="Arial" w:hAnsi="Arial"/>
+          <w:color w:val="4A5568"/>
+          <w:sz w:val="22"/>
+          <w:szCs w:val="22"/>
+        </w:rPr>
+        <w:t xml:space="preserve">frontend/src/pages/terapeuta/interno/Conocimiento.jsx — sección duplicada eliminada; borde lateral de estado en lista.</w:t>
+      </w:r>
+    </w:p>
+    <w:p>
+      <w:pPr>
+        <w:numPr>
+          <w:ilvl w:val="0"/>
+          <w:numId w:val="2"/>
+        </w:numPr>
+        <w:spacing w:after="40" w:before="40" w:line="276"/>
+      </w:pPr>
+      <w:r>
+        <w:rPr>
+          <w:rFonts w:ascii="Arial" w:cs="Arial" w:eastAsia="Arial" w:hAnsi="Arial"/>
+          <w:color w:val="4A5568"/>
+          <w:sz w:val="22"/>
+          <w:szCs w:val="22"/>
+        </w:rPr>
+        <w:t xml:space="preserve">frontend/src/pages/terapeuta/interno/ContactosDerivados.jsx — modal simulación de email con datos de acceso del familiar.</w:t>
+      </w:r>
+    </w:p>
+    <w:p>
+      <w:pPr>
+        <w:numPr>
+          <w:ilvl w:val="0"/>
+          <w:numId w:val="2"/>
+        </w:numPr>
+        <w:spacing w:after="40" w:before="40" w:line="276"/>
+      </w:pPr>
+      <w:r>
+        <w:rPr>
+          <w:rFonts w:ascii="Arial" w:cs="Arial" w:eastAsia="Arial" w:hAnsi="Arial"/>
+          <w:color w:val="4A5568"/>
+          <w:sz w:val="22"/>
+          <w:szCs w:val="22"/>
+        </w:rPr>
+        <w:t xml:space="preserve">backend/app/models/usuario.py — columna debe_cambiar_password.</w:t>
+      </w:r>
+    </w:p>
+    <w:p>
+      <w:pPr>
+        <w:numPr>
+          <w:ilvl w:val="0"/>
+          <w:numId w:val="2"/>
+        </w:numPr>
+        <w:spacing w:after="40" w:before="40" w:line="276"/>
+      </w:pPr>
+      <w:r>
+        <w:rPr>
+          <w:rFonts w:ascii="Arial" w:cs="Arial" w:eastAsia="Arial" w:hAnsi="Arial"/>
+          <w:color w:val="4A5568"/>
+          <w:sz w:val="22"/>
+          <w:szCs w:val="22"/>
+        </w:rPr>
+        <w:t xml:space="preserve">backend/app/api/auth_router.py, ter_int_contactos_router.py, usuario_router.py — actualizados para soportar el flujo de contraseña temporal.</w:t>
+      </w:r>
+    </w:p>
+    <w:p>
+      <w:pPr>
+        <w:numPr>
+          <w:ilvl w:val="0"/>
+          <w:numId w:val="2"/>
+        </w:numPr>
+        <w:spacing w:after="40" w:before="40" w:line="276"/>
+      </w:pPr>
+      <w:r>
+        <w:rPr>
+          <w:rFonts w:ascii="Arial" w:cs="Arial" w:eastAsia="Arial" w:hAnsi="Arial"/>
+          <w:color w:val="4A5568"/>
+          <w:sz w:val="22"/>
+          <w:szCs w:val="22"/>
+        </w:rPr>
+        <w:t xml:space="preserve">backend/app/api/sesion_ia_router.py — logging de errores en pipeline RAG.</w:t>
+      </w:r>
+    </w:p>
+    <w:p>
+      <w:pPr>
+        <w:numPr>
+          <w:ilvl w:val="0"/>
+          <w:numId w:val="2"/>
+        </w:numPr>
+        <w:spacing w:after="40" w:before="40" w:line="276"/>
+      </w:pPr>
+      <w:r>
+        <w:rPr>
+          <w:rFonts w:ascii="Arial" w:cs="Arial" w:eastAsia="Arial" w:hAnsi="Arial"/>
+          <w:color w:val="4A5568"/>
+          <w:sz w:val="22"/>
+          <w:szCs w:val="22"/>
+        </w:rPr>
+        <w:t xml:space="preserve">backend/app/main.py — nav_config del rol admin actualizado con “Base de conocimiento”.</w:t>
+      </w:r>
+    </w:p>
     <w:sectPr>
       <w:headerReference w:type="default" r:id="rId7"/>
       <w:footerReference w:type="default" r:id="rId8"/>

</xml_diff>